<commit_message>
Atualiza minuta de ARP da TIME CINE no PE 311/2026
</commit_message>
<xml_diff>
--- a/Pregão - Iluminação e Sonorização/Processo atual/Minuta_ARP_TIME_CINE_PE_311_2026.docx
+++ b/Pregão - Iluminação e Sonorização/Processo atual/Minuta_ARP_TIME_CINE_PE_311_2026.docx
@@ -1414,8 +1414,9 @@
     </w:p>
     <w:tbl>
       <w:tblPr>
-        <w:tblW w:w="0" w:type="auto"/>
-        <w:tblLook w:val="01E0" w:firstRow="1" w:lastRow="1" w:firstColumn="1" w:lastColumn="1" w:noHBand="0" w:noVBand="0"/>
+        <w:tblW w:type="dxa" w:w="9071"/>
+        <w:tblLayout w:type="fixed"/>
+        <w:tblLook w:firstColumn="1" w:firstRow="1" w:lastColumn="0" w:lastRow="0" w:noHBand="0" w:noVBand="1" w:val="04A0"/>
         <w:tblBorders>
           <w:top w:val="single" w:sz="4" w:color="000000"/>
           <w:left w:val="single" w:sz="4" w:color="000000"/>
@@ -1426,114 +1427,114 @@
         </w:tblBorders>
       </w:tblPr>
       <w:tblGrid>
-        <w:gridCol w:w="2244"/>
-        <w:gridCol w:w="2244"/>
-        <w:gridCol w:w="2245"/>
-        <w:gridCol w:w="2245"/>
+        <w:gridCol w:w="3175"/>
+        <w:gridCol w:w="907"/>
+        <w:gridCol w:w="850"/>
+        <w:gridCol w:w="1006"/>
+        <w:gridCol w:w="1006"/>
+        <w:gridCol w:w="1006"/>
+        <w:gridCol w:w="1006"/>
       </w:tblGrid>
       <w:tr>
         <w:trPr>
           <w:cantSplit/>
-          <w:cantSplit/>
+          <w:tblHeader/>
         </w:trPr>
         <w:tc>
           <w:tcPr>
-            <w:tcW w:w="2244" w:type="dxa"/>
-            <w:tcBorders>
-              <w:top w:val="single" w:sz="6" w:color="000000"/>
-              <w:left w:val="single" w:sz="6" w:color="000000"/>
-              <w:bottom w:val="single" w:sz="6" w:color="000000"/>
-              <w:right w:val="single" w:sz="6" w:color="000000"/>
-            </w:tcBorders>
-            <w:shd w:fill="E7E6E6"/>
-          </w:tcPr>
-          <w:p>
-            <w:pPr>
-              <w:spacing w:after="60" w:before="60"/>
-            </w:pPr>
-            <w:r>
-              <w:rPr>
-                <w:rFonts w:ascii="Times New Roman" w:hAnsi="Times New Roman"/>
+            <w:tcW w:type="dxa" w:w="3175"/>
+            <w:vMerge w:val="restart"/>
+            <w:vAlign w:val="center"/>
+            <w:shd w:fill="C6D9ED"/>
+            <w:shd w:fill="C6D9ED"/>
+          </w:tcPr>
+          <w:p>
+            <w:pPr>
+              <w:spacing w:before="60" w:after="60"/>
+              <w:jc w:val="center"/>
+            </w:pPr>
+            <w:r>
+              <w:rPr>
+                <w:rFonts w:ascii="Times New Roman" w:hAnsi="Times New Roman"/>
+                <w:b/>
+                <w:color w:val="000000"/>
+                <w:sz w:val="18"/>
+              </w:rPr>
+              <w:t>Órgão / campus</w:t>
+            </w:r>
+          </w:p>
+        </w:tc>
+        <w:tc>
+          <w:tcPr>
+            <w:tcW w:type="dxa" w:w="907"/>
+            <w:vMerge w:val="restart"/>
+            <w:vAlign w:val="center"/>
+            <w:shd w:fill="C6D9ED"/>
+            <w:shd w:fill="C6D9ED"/>
+          </w:tcPr>
+          <w:p>
+            <w:pPr>
+              <w:spacing w:before="60" w:after="60"/>
+              <w:jc w:val="center"/>
+            </w:pPr>
+            <w:r>
+              <w:rPr>
+                <w:rFonts w:ascii="Times New Roman" w:hAnsi="Times New Roman"/>
+                <w:b/>
+                <w:color w:val="000000"/>
+                <w:sz w:val="18"/>
+              </w:rPr>
+              <w:t>UASG</w:t>
+            </w:r>
+          </w:p>
+        </w:tc>
+        <w:tc>
+          <w:tcPr>
+            <w:tcW w:type="dxa" w:w="850"/>
+            <w:vMerge w:val="restart"/>
+            <w:vAlign w:val="center"/>
+            <w:shd w:fill="C6D9ED"/>
+            <w:shd w:fill="C6D9ED"/>
+          </w:tcPr>
+          <w:p>
+            <w:pPr>
+              <w:spacing w:before="60" w:after="60"/>
+              <w:jc w:val="center"/>
+            </w:pPr>
+            <w:r>
+              <w:rPr>
+                <w:rFonts w:ascii="Times New Roman" w:hAnsi="Times New Roman"/>
+                <w:b/>
                 <w:color w:val="000000"/>
                 <w:sz w:val="16"/>
               </w:rPr>
-              <w:t>Órgão / campus</w:t>
-            </w:r>
-          </w:p>
-        </w:tc>
-        <w:tc>
-          <w:tcPr>
-            <w:tcW w:w="2244" w:type="dxa"/>
-            <w:tcBorders>
-              <w:top w:val="single" w:sz="6" w:color="000000"/>
-              <w:left w:val="single" w:sz="6" w:color="000000"/>
-              <w:bottom w:val="single" w:sz="6" w:color="000000"/>
-              <w:right w:val="single" w:sz="6" w:color="000000"/>
-            </w:tcBorders>
-            <w:shd w:fill="E7E6E6"/>
-          </w:tcPr>
-          <w:p>
-            <w:pPr>
-              <w:spacing w:after="60" w:before="60"/>
-            </w:pPr>
-            <w:r>
-              <w:rPr>
-                <w:rFonts w:ascii="Times New Roman" w:hAnsi="Times New Roman"/>
-                <w:color w:val="000000"/>
-                <w:sz w:val="16"/>
-              </w:rPr>
-              <w:t>UASG</w:t>
-            </w:r>
-          </w:p>
-        </w:tc>
-        <w:tc>
-          <w:tcPr>
-            <w:tcW w:w="2245" w:type="dxa"/>
-            <w:tcBorders>
-              <w:top w:val="single" w:sz="6" w:color="000000"/>
-              <w:left w:val="single" w:sz="6" w:color="000000"/>
-              <w:bottom w:val="single" w:sz="6" w:color="000000"/>
-              <w:right w:val="single" w:sz="6" w:color="000000"/>
-            </w:tcBorders>
-            <w:shd w:fill="E7E6E6"/>
-          </w:tcPr>
-          <w:p>
-            <w:pPr>
-              <w:spacing w:after="60" w:before="60"/>
-            </w:pPr>
-            <w:r>
-              <w:rPr>
-                <w:rFonts w:ascii="Times New Roman" w:hAnsi="Times New Roman"/>
-                <w:color w:val="000000"/>
-                <w:sz w:val="16"/>
-              </w:rPr>
               <w:t>Unidade</w:t>
             </w:r>
           </w:p>
         </w:tc>
         <w:tc>
           <w:tcPr>
-            <w:tcW w:w="2245" w:type="dxa"/>
-            <w:tcBorders>
-              <w:top w:val="single" w:sz="6" w:color="000000"/>
-              <w:left w:val="single" w:sz="6" w:color="000000"/>
-              <w:bottom w:val="single" w:sz="6" w:color="000000"/>
-              <w:right w:val="single" w:sz="6" w:color="000000"/>
-            </w:tcBorders>
-            <w:shd w:fill="E7E6E6"/>
-          </w:tcPr>
-          <w:p>
-            <w:pPr>
+            <w:tcW w:type="dxa" w:w="4025"/>
+            <w:gridSpan w:val="4"/>
+            <w:vAlign w:val="center"/>
+            <w:shd w:fill="C6D9ED"/>
+            <w:shd w:fill="C6D9ED"/>
+            <w:shd w:fill="C6D9ED"/>
+            <w:shd w:fill="C6D9ED"/>
+          </w:tcPr>
+          <w:p>
+            <w:pPr>
+              <w:spacing w:before="60" w:after="60"/>
               <w:jc w:val="center"/>
             </w:pPr>
             <w:r>
               <w:rPr>
-                <w:rFonts w:ascii="Consolas" w:hAnsi="Consolas"/>
-                <w:sz w:val="16"/>
+                <w:rFonts w:ascii="Times New Roman" w:hAnsi="Times New Roman"/>
+                <w:b/>
+                <w:color w:val="000000"/>
+                <w:sz w:val="18"/>
               </w:rPr>
               <w:t>QUANTIDADES</w:t>
-              <w:br/>
-              <w:t>Item 1 | Item 2 | Item 3 | Item 4</w:t>
             </w:r>
           </w:p>
         </w:tc>
@@ -1541,104 +1542,114 @@
       <w:tr>
         <w:trPr>
           <w:cantSplit/>
-          <w:cantSplit/>
+          <w:tblHeader/>
         </w:trPr>
         <w:tc>
           <w:tcPr>
-            <w:tcW w:type="dxa" w:w="2244"/>
-            <w:tcBorders>
-              <w:top w:val="single" w:sz="6" w:color="000000"/>
-              <w:left w:val="single" w:sz="6" w:color="000000"/>
-              <w:bottom w:val="single" w:sz="6" w:color="000000"/>
-              <w:right w:val="single" w:sz="6" w:color="000000"/>
-            </w:tcBorders>
-            <w:shd w:fill="DEEAF6"/>
-          </w:tcPr>
-          <w:p>
-            <w:pPr>
-              <w:spacing w:after="60" w:before="60"/>
-            </w:pPr>
-            <w:r>
-              <w:rPr>
-                <w:rFonts w:ascii="Times New Roman" w:hAnsi="Times New Roman"/>
-                <w:color w:val="000000"/>
-                <w:sz w:val="16"/>
-              </w:rPr>
-              <w:t>Reitoria (gerenciador)</w:t>
-            </w:r>
-          </w:p>
-        </w:tc>
-        <w:tc>
-          <w:tcPr>
-            <w:tcW w:type="dxa" w:w="2244"/>
-            <w:tcBorders>
-              <w:top w:val="single" w:sz="6" w:color="000000"/>
-              <w:left w:val="single" w:sz="6" w:color="000000"/>
-              <w:bottom w:val="single" w:sz="6" w:color="000000"/>
-              <w:right w:val="single" w:sz="6" w:color="000000"/>
-            </w:tcBorders>
-            <w:shd w:fill="DEEAF6"/>
-          </w:tcPr>
-          <w:p>
-            <w:pPr>
-              <w:spacing w:after="60" w:before="60"/>
-            </w:pPr>
-            <w:r>
-              <w:rPr>
-                <w:rFonts w:ascii="Times New Roman" w:hAnsi="Times New Roman"/>
-                <w:color w:val="000000"/>
-                <w:sz w:val="16"/>
-              </w:rPr>
-              <w:t>153167</w:t>
-            </w:r>
-          </w:p>
-        </w:tc>
-        <w:tc>
-          <w:tcPr>
-            <w:tcW w:type="dxa" w:w="2245"/>
-            <w:tcBorders>
-              <w:top w:val="single" w:sz="6" w:color="000000"/>
-              <w:left w:val="single" w:sz="6" w:color="000000"/>
-              <w:bottom w:val="single" w:sz="6" w:color="000000"/>
-              <w:right w:val="single" w:sz="6" w:color="000000"/>
-            </w:tcBorders>
-            <w:shd w:fill="DEEAF6"/>
-          </w:tcPr>
-          <w:p>
-            <w:pPr>
-              <w:spacing w:after="60" w:before="60"/>
-            </w:pPr>
-            <w:r>
-              <w:rPr>
-                <w:rFonts w:ascii="Times New Roman" w:hAnsi="Times New Roman"/>
-                <w:color w:val="000000"/>
-                <w:sz w:val="16"/>
-              </w:rPr>
-              <w:t>Diária</w:t>
-            </w:r>
-          </w:p>
-        </w:tc>
-        <w:tc>
-          <w:tcPr>
-            <w:tcW w:type="dxa" w:w="2245"/>
-            <w:tcBorders>
-              <w:top w:val="single" w:sz="6" w:color="000000"/>
-              <w:left w:val="single" w:sz="6" w:color="000000"/>
-              <w:bottom w:val="single" w:sz="6" w:color="000000"/>
-              <w:right w:val="single" w:sz="6" w:color="000000"/>
-            </w:tcBorders>
-            <w:shd w:fill="DEEAF6"/>
-          </w:tcPr>
-          <w:p>
-            <w:pPr>
+            <w:tcW w:type="dxa" w:w="1296"/>
+            <w:vMerge/>
+          </w:tcPr>
+          <w:p/>
+        </w:tc>
+        <w:tc>
+          <w:tcPr>
+            <w:tcW w:type="dxa" w:w="1296"/>
+            <w:vMerge/>
+          </w:tcPr>
+          <w:p/>
+        </w:tc>
+        <w:tc>
+          <w:tcPr>
+            <w:tcW w:type="dxa" w:w="1296"/>
+            <w:vMerge/>
+          </w:tcPr>
+          <w:p/>
+        </w:tc>
+        <w:tc>
+          <w:tcPr>
+            <w:tcW w:type="dxa" w:w="1006"/>
+            <w:vAlign w:val="center"/>
+            <w:shd w:fill="C6D9ED"/>
+          </w:tcPr>
+          <w:p>
+            <w:pPr>
+              <w:spacing w:before="60" w:after="60"/>
               <w:jc w:val="center"/>
             </w:pPr>
             <w:r>
               <w:rPr>
-                <w:rFonts w:ascii="Consolas" w:hAnsi="Consolas"/>
-                <w:sz w:val="16"/>
-              </w:rPr>
-              <w:t>70 | 180 | 180 | 145</w:t>
+                <w:rFonts w:ascii="Times New Roman" w:hAnsi="Times New Roman"/>
+                <w:b/>
+                <w:color w:val="000000"/>
+                <w:sz w:val="18"/>
+              </w:rPr>
+              <w:t>Item 1</w:t>
+            </w:r>
+          </w:p>
+        </w:tc>
+        <w:tc>
+          <w:tcPr>
+            <w:tcW w:type="dxa" w:w="1006"/>
+            <w:vAlign w:val="center"/>
+            <w:shd w:fill="C6D9ED"/>
+          </w:tcPr>
+          <w:p>
+            <w:pPr>
+              <w:spacing w:before="60" w:after="60"/>
+              <w:jc w:val="center"/>
+            </w:pPr>
+            <w:r>
+              <w:rPr>
+                <w:rFonts w:ascii="Times New Roman" w:hAnsi="Times New Roman"/>
+                <w:b/>
+                <w:color w:val="000000"/>
+                <w:sz w:val="18"/>
+              </w:rPr>
+              <w:t>Item 2</w:t>
+            </w:r>
+          </w:p>
+        </w:tc>
+        <w:tc>
+          <w:tcPr>
+            <w:tcW w:type="dxa" w:w="1006"/>
+            <w:vAlign w:val="center"/>
+            <w:shd w:fill="C6D9ED"/>
+          </w:tcPr>
+          <w:p>
+            <w:pPr>
+              <w:spacing w:before="60" w:after="60"/>
+              <w:jc w:val="center"/>
+            </w:pPr>
+            <w:r>
+              <w:rPr>
+                <w:rFonts w:ascii="Times New Roman" w:hAnsi="Times New Roman"/>
+                <w:b/>
+                <w:color w:val="000000"/>
+                <w:sz w:val="18"/>
+              </w:rPr>
+              <w:t>Item 3</w:t>
+            </w:r>
+          </w:p>
+        </w:tc>
+        <w:tc>
+          <w:tcPr>
+            <w:tcW w:type="dxa" w:w="1006"/>
+            <w:vAlign w:val="center"/>
+            <w:shd w:fill="C6D9ED"/>
+          </w:tcPr>
+          <w:p>
+            <w:pPr>
+              <w:spacing w:before="60" w:after="60"/>
+              <w:jc w:val="center"/>
+            </w:pPr>
+            <w:r>
+              <w:rPr>
+                <w:rFonts w:ascii="Times New Roman" w:hAnsi="Times New Roman"/>
+                <w:b/>
+                <w:color w:val="000000"/>
+                <w:sz w:val="18"/>
+              </w:rPr>
+              <w:t>Item 4</w:t>
             </w:r>
           </w:p>
         </w:tc>
@@ -1646,78 +1657,68 @@
       <w:tr>
         <w:trPr>
           <w:cantSplit/>
-          <w:cantSplit/>
         </w:trPr>
         <w:tc>
           <w:tcPr>
-            <w:tcW w:type="dxa" w:w="2244"/>
-            <w:tcBorders>
-              <w:top w:val="single" w:sz="6" w:color="000000"/>
-              <w:left w:val="single" w:sz="6" w:color="000000"/>
-              <w:bottom w:val="single" w:sz="6" w:color="000000"/>
-              <w:right w:val="single" w:sz="6" w:color="000000"/>
-            </w:tcBorders>
+            <w:tcW w:type="dxa" w:w="3175"/>
+            <w:vAlign w:val="center"/>
             <w:shd w:fill="DEEAF6"/>
           </w:tcPr>
           <w:p>
             <w:pPr>
-              <w:spacing w:after="60" w:before="60"/>
-            </w:pPr>
-            <w:r>
-              <w:rPr>
-                <w:rFonts w:ascii="Times New Roman" w:hAnsi="Times New Roman"/>
-                <w:color w:val="000000"/>
-                <w:sz w:val="16"/>
-              </w:rPr>
-              <w:t>Realengo I</w:t>
-            </w:r>
-          </w:p>
-        </w:tc>
-        <w:tc>
-          <w:tcPr>
-            <w:tcW w:type="dxa" w:w="2244"/>
-            <w:tcBorders>
-              <w:top w:val="single" w:sz="6" w:color="000000"/>
-              <w:left w:val="single" w:sz="6" w:color="000000"/>
-              <w:bottom w:val="single" w:sz="6" w:color="000000"/>
-              <w:right w:val="single" w:sz="6" w:color="000000"/>
-            </w:tcBorders>
+              <w:spacing w:before="60" w:after="60"/>
+              <w:jc w:val="left"/>
+            </w:pPr>
+            <w:r>
+              <w:rPr>
+                <w:rFonts w:ascii="Times New Roman" w:hAnsi="Times New Roman"/>
+                <w:b w:val="0"/>
+                <w:color w:val="000000"/>
+                <w:sz w:val="18"/>
+              </w:rPr>
+              <w:t>Reitoria (gerenciador)</w:t>
+            </w:r>
+          </w:p>
+        </w:tc>
+        <w:tc>
+          <w:tcPr>
+            <w:tcW w:type="dxa" w:w="907"/>
+            <w:vAlign w:val="center"/>
             <w:shd w:fill="DEEAF6"/>
           </w:tcPr>
           <w:p>
             <w:pPr>
-              <w:spacing w:after="60" w:before="60"/>
-            </w:pPr>
-            <w:r>
-              <w:rPr>
-                <w:rFonts w:ascii="Times New Roman" w:hAnsi="Times New Roman"/>
-                <w:color w:val="000000"/>
-                <w:sz w:val="16"/>
-              </w:rPr>
-              <w:t>155626</w:t>
-            </w:r>
-          </w:p>
-        </w:tc>
-        <w:tc>
-          <w:tcPr>
-            <w:tcW w:type="dxa" w:w="2245"/>
-            <w:tcBorders>
-              <w:top w:val="single" w:sz="6" w:color="000000"/>
-              <w:left w:val="single" w:sz="6" w:color="000000"/>
-              <w:bottom w:val="single" w:sz="6" w:color="000000"/>
-              <w:right w:val="single" w:sz="6" w:color="000000"/>
-            </w:tcBorders>
+              <w:spacing w:before="60" w:after="60"/>
+              <w:jc w:val="center"/>
+            </w:pPr>
+            <w:r>
+              <w:rPr>
+                <w:rFonts w:ascii="Times New Roman" w:hAnsi="Times New Roman"/>
+                <w:b w:val="0"/>
+                <w:color w:val="000000"/>
+                <w:sz w:val="18"/>
+              </w:rPr>
+              <w:t>153167</w:t>
+            </w:r>
+          </w:p>
+        </w:tc>
+        <w:tc>
+          <w:tcPr>
+            <w:tcW w:type="dxa" w:w="850"/>
+            <w:vAlign w:val="center"/>
             <w:shd w:fill="DEEAF6"/>
           </w:tcPr>
           <w:p>
             <w:pPr>
-              <w:spacing w:after="60" w:before="60"/>
-            </w:pPr>
-            <w:r>
-              <w:rPr>
-                <w:rFonts w:ascii="Times New Roman" w:hAnsi="Times New Roman"/>
-                <w:color w:val="000000"/>
-                <w:sz w:val="16"/>
+              <w:spacing w:before="60" w:after="60"/>
+              <w:jc w:val="center"/>
+            </w:pPr>
+            <w:r>
+              <w:rPr>
+                <w:rFonts w:ascii="Times New Roman" w:hAnsi="Times New Roman"/>
+                <w:b w:val="0"/>
+                <w:color w:val="000000"/>
+                <w:sz w:val="18"/>
               </w:rPr>
               <w:t>Diária</w:t>
             </w:r>
@@ -1725,25 +1726,89 @@
         </w:tc>
         <w:tc>
           <w:tcPr>
-            <w:tcW w:type="dxa" w:w="2245"/>
-            <w:tcBorders>
-              <w:top w:val="single" w:sz="6" w:color="000000"/>
-              <w:left w:val="single" w:sz="6" w:color="000000"/>
-              <w:bottom w:val="single" w:sz="6" w:color="000000"/>
-              <w:right w:val="single" w:sz="6" w:color="000000"/>
-            </w:tcBorders>
+            <w:tcW w:type="dxa" w:w="1006"/>
+            <w:vAlign w:val="center"/>
             <w:shd w:fill="DEEAF6"/>
           </w:tcPr>
           <w:p>
             <w:pPr>
+              <w:spacing w:before="60" w:after="60"/>
               <w:jc w:val="center"/>
             </w:pPr>
             <w:r>
               <w:rPr>
-                <w:rFonts w:ascii="Consolas" w:hAnsi="Consolas"/>
-                <w:sz w:val="16"/>
-              </w:rPr>
-              <w:t>25 | 50 | 40 | 15</w:t>
+                <w:rFonts w:ascii="Times New Roman" w:hAnsi="Times New Roman"/>
+                <w:b w:val="0"/>
+                <w:color w:val="000000"/>
+                <w:sz w:val="18"/>
+              </w:rPr>
+              <w:t>70</w:t>
+            </w:r>
+          </w:p>
+        </w:tc>
+        <w:tc>
+          <w:tcPr>
+            <w:tcW w:type="dxa" w:w="1006"/>
+            <w:vAlign w:val="center"/>
+            <w:shd w:fill="DEEAF6"/>
+          </w:tcPr>
+          <w:p>
+            <w:pPr>
+              <w:spacing w:before="60" w:after="60"/>
+              <w:jc w:val="center"/>
+            </w:pPr>
+            <w:r>
+              <w:rPr>
+                <w:rFonts w:ascii="Times New Roman" w:hAnsi="Times New Roman"/>
+                <w:b w:val="0"/>
+                <w:color w:val="000000"/>
+                <w:sz w:val="18"/>
+              </w:rPr>
+              <w:t>180</w:t>
+            </w:r>
+          </w:p>
+        </w:tc>
+        <w:tc>
+          <w:tcPr>
+            <w:tcW w:type="dxa" w:w="1006"/>
+            <w:vAlign w:val="center"/>
+            <w:shd w:fill="DEEAF6"/>
+          </w:tcPr>
+          <w:p>
+            <w:pPr>
+              <w:spacing w:before="60" w:after="60"/>
+              <w:jc w:val="center"/>
+            </w:pPr>
+            <w:r>
+              <w:rPr>
+                <w:rFonts w:ascii="Times New Roman" w:hAnsi="Times New Roman"/>
+                <w:b w:val="0"/>
+                <w:color w:val="000000"/>
+                <w:sz w:val="18"/>
+              </w:rPr>
+              <w:t>180</w:t>
+            </w:r>
+          </w:p>
+        </w:tc>
+        <w:tc>
+          <w:tcPr>
+            <w:tcW w:type="dxa" w:w="1006"/>
+            <w:vAlign w:val="center"/>
+            <w:shd w:fill="DEEAF6"/>
+          </w:tcPr>
+          <w:p>
+            <w:pPr>
+              <w:spacing w:before="60" w:after="60"/>
+              <w:jc w:val="center"/>
+            </w:pPr>
+            <w:r>
+              <w:rPr>
+                <w:rFonts w:ascii="Times New Roman" w:hAnsi="Times New Roman"/>
+                <w:b w:val="0"/>
+                <w:color w:val="000000"/>
+                <w:sz w:val="18"/>
+              </w:rPr>
+              <w:t>145</w:t>
             </w:r>
           </w:p>
         </w:tc>
@@ -1751,78 +1816,68 @@
       <w:tr>
         <w:trPr>
           <w:cantSplit/>
-          <w:cantSplit/>
         </w:trPr>
         <w:tc>
           <w:tcPr>
-            <w:tcW w:type="dxa" w:w="2244"/>
-            <w:tcBorders>
-              <w:top w:val="single" w:sz="6" w:color="000000"/>
-              <w:left w:val="single" w:sz="6" w:color="000000"/>
-              <w:bottom w:val="single" w:sz="6" w:color="000000"/>
-              <w:right w:val="single" w:sz="6" w:color="000000"/>
-            </w:tcBorders>
+            <w:tcW w:type="dxa" w:w="3175"/>
+            <w:vAlign w:val="center"/>
             <w:shd w:fill="DEEAF6"/>
           </w:tcPr>
           <w:p>
             <w:pPr>
-              <w:spacing w:after="60" w:before="60"/>
-            </w:pPr>
-            <w:r>
-              <w:rPr>
-                <w:rFonts w:ascii="Times New Roman" w:hAnsi="Times New Roman"/>
-                <w:color w:val="000000"/>
-                <w:sz w:val="16"/>
-              </w:rPr>
-              <w:t>Realengo II</w:t>
-            </w:r>
-          </w:p>
-        </w:tc>
-        <w:tc>
-          <w:tcPr>
-            <w:tcW w:type="dxa" w:w="2244"/>
-            <w:tcBorders>
-              <w:top w:val="single" w:sz="6" w:color="000000"/>
-              <w:left w:val="single" w:sz="6" w:color="000000"/>
-              <w:bottom w:val="single" w:sz="6" w:color="000000"/>
-              <w:right w:val="single" w:sz="6" w:color="000000"/>
-            </w:tcBorders>
+              <w:spacing w:before="60" w:after="60"/>
+              <w:jc w:val="left"/>
+            </w:pPr>
+            <w:r>
+              <w:rPr>
+                <w:rFonts w:ascii="Times New Roman" w:hAnsi="Times New Roman"/>
+                <w:b w:val="0"/>
+                <w:color w:val="000000"/>
+                <w:sz w:val="18"/>
+              </w:rPr>
+              <w:t>Realengo I</w:t>
+            </w:r>
+          </w:p>
+        </w:tc>
+        <w:tc>
+          <w:tcPr>
+            <w:tcW w:type="dxa" w:w="907"/>
+            <w:vAlign w:val="center"/>
             <w:shd w:fill="DEEAF6"/>
           </w:tcPr>
           <w:p>
             <w:pPr>
-              <w:spacing w:after="60" w:before="60"/>
-            </w:pPr>
-            <w:r>
-              <w:rPr>
-                <w:rFonts w:ascii="Times New Roman" w:hAnsi="Times New Roman"/>
-                <w:color w:val="000000"/>
-                <w:sz w:val="16"/>
-              </w:rPr>
-              <w:t>155627</w:t>
-            </w:r>
-          </w:p>
-        </w:tc>
-        <w:tc>
-          <w:tcPr>
-            <w:tcW w:type="dxa" w:w="2245"/>
-            <w:tcBorders>
-              <w:top w:val="single" w:sz="6" w:color="000000"/>
-              <w:left w:val="single" w:sz="6" w:color="000000"/>
-              <w:bottom w:val="single" w:sz="6" w:color="000000"/>
-              <w:right w:val="single" w:sz="6" w:color="000000"/>
-            </w:tcBorders>
+              <w:spacing w:before="60" w:after="60"/>
+              <w:jc w:val="center"/>
+            </w:pPr>
+            <w:r>
+              <w:rPr>
+                <w:rFonts w:ascii="Times New Roman" w:hAnsi="Times New Roman"/>
+                <w:b w:val="0"/>
+                <w:color w:val="000000"/>
+                <w:sz w:val="18"/>
+              </w:rPr>
+              <w:t>155626</w:t>
+            </w:r>
+          </w:p>
+        </w:tc>
+        <w:tc>
+          <w:tcPr>
+            <w:tcW w:type="dxa" w:w="850"/>
+            <w:vAlign w:val="center"/>
             <w:shd w:fill="DEEAF6"/>
           </w:tcPr>
           <w:p>
             <w:pPr>
-              <w:spacing w:after="60" w:before="60"/>
-            </w:pPr>
-            <w:r>
-              <w:rPr>
-                <w:rFonts w:ascii="Times New Roman" w:hAnsi="Times New Roman"/>
-                <w:color w:val="000000"/>
-                <w:sz w:val="16"/>
+              <w:spacing w:before="60" w:after="60"/>
+              <w:jc w:val="center"/>
+            </w:pPr>
+            <w:r>
+              <w:rPr>
+                <w:rFonts w:ascii="Times New Roman" w:hAnsi="Times New Roman"/>
+                <w:b w:val="0"/>
+                <w:color w:val="000000"/>
+                <w:sz w:val="18"/>
               </w:rPr>
               <w:t>Diária</w:t>
             </w:r>
@@ -1830,25 +1885,89 @@
         </w:tc>
         <w:tc>
           <w:tcPr>
-            <w:tcW w:type="dxa" w:w="2245"/>
-            <w:tcBorders>
-              <w:top w:val="single" w:sz="6" w:color="000000"/>
-              <w:left w:val="single" w:sz="6" w:color="000000"/>
-              <w:bottom w:val="single" w:sz="6" w:color="000000"/>
-              <w:right w:val="single" w:sz="6" w:color="000000"/>
-            </w:tcBorders>
+            <w:tcW w:type="dxa" w:w="1006"/>
+            <w:vAlign w:val="center"/>
             <w:shd w:fill="DEEAF6"/>
           </w:tcPr>
           <w:p>
             <w:pPr>
+              <w:spacing w:before="60" w:after="60"/>
               <w:jc w:val="center"/>
             </w:pPr>
             <w:r>
               <w:rPr>
-                <w:rFonts w:ascii="Consolas" w:hAnsi="Consolas"/>
-                <w:sz w:val="16"/>
-              </w:rPr>
-              <w:t>30 | 30 | 30 | 5</w:t>
+                <w:rFonts w:ascii="Times New Roman" w:hAnsi="Times New Roman"/>
+                <w:b w:val="0"/>
+                <w:color w:val="000000"/>
+                <w:sz w:val="18"/>
+              </w:rPr>
+              <w:t>25</w:t>
+            </w:r>
+          </w:p>
+        </w:tc>
+        <w:tc>
+          <w:tcPr>
+            <w:tcW w:type="dxa" w:w="1006"/>
+            <w:vAlign w:val="center"/>
+            <w:shd w:fill="DEEAF6"/>
+          </w:tcPr>
+          <w:p>
+            <w:pPr>
+              <w:spacing w:before="60" w:after="60"/>
+              <w:jc w:val="center"/>
+            </w:pPr>
+            <w:r>
+              <w:rPr>
+                <w:rFonts w:ascii="Times New Roman" w:hAnsi="Times New Roman"/>
+                <w:b w:val="0"/>
+                <w:color w:val="000000"/>
+                <w:sz w:val="18"/>
+              </w:rPr>
+              <w:t>50</w:t>
+            </w:r>
+          </w:p>
+        </w:tc>
+        <w:tc>
+          <w:tcPr>
+            <w:tcW w:type="dxa" w:w="1006"/>
+            <w:vAlign w:val="center"/>
+            <w:shd w:fill="DEEAF6"/>
+          </w:tcPr>
+          <w:p>
+            <w:pPr>
+              <w:spacing w:before="60" w:after="60"/>
+              <w:jc w:val="center"/>
+            </w:pPr>
+            <w:r>
+              <w:rPr>
+                <w:rFonts w:ascii="Times New Roman" w:hAnsi="Times New Roman"/>
+                <w:b w:val="0"/>
+                <w:color w:val="000000"/>
+                <w:sz w:val="18"/>
+              </w:rPr>
+              <w:t>40</w:t>
+            </w:r>
+          </w:p>
+        </w:tc>
+        <w:tc>
+          <w:tcPr>
+            <w:tcW w:type="dxa" w:w="1006"/>
+            <w:vAlign w:val="center"/>
+            <w:shd w:fill="DEEAF6"/>
+          </w:tcPr>
+          <w:p>
+            <w:pPr>
+              <w:spacing w:before="60" w:after="60"/>
+              <w:jc w:val="center"/>
+            </w:pPr>
+            <w:r>
+              <w:rPr>
+                <w:rFonts w:ascii="Times New Roman" w:hAnsi="Times New Roman"/>
+                <w:b w:val="0"/>
+                <w:color w:val="000000"/>
+                <w:sz w:val="18"/>
+              </w:rPr>
+              <w:t>15</w:t>
             </w:r>
           </w:p>
         </w:tc>
@@ -1856,78 +1975,68 @@
       <w:tr>
         <w:trPr>
           <w:cantSplit/>
-          <w:cantSplit/>
         </w:trPr>
         <w:tc>
           <w:tcPr>
-            <w:tcW w:type="dxa" w:w="2244"/>
-            <w:tcBorders>
-              <w:top w:val="single" w:sz="6" w:color="000000"/>
-              <w:left w:val="single" w:sz="6" w:color="000000"/>
-              <w:bottom w:val="single" w:sz="6" w:color="000000"/>
-              <w:right w:val="single" w:sz="6" w:color="000000"/>
-            </w:tcBorders>
+            <w:tcW w:type="dxa" w:w="3175"/>
+            <w:vAlign w:val="center"/>
             <w:shd w:fill="DEEAF6"/>
           </w:tcPr>
           <w:p>
             <w:pPr>
-              <w:spacing w:after="60" w:before="60"/>
-            </w:pPr>
-            <w:r>
-              <w:rPr>
-                <w:rFonts w:ascii="Times New Roman" w:hAnsi="Times New Roman"/>
-                <w:color w:val="000000"/>
-                <w:sz w:val="16"/>
-              </w:rPr>
-              <w:t>São Cristóvão I</w:t>
-            </w:r>
-          </w:p>
-        </w:tc>
-        <w:tc>
-          <w:tcPr>
-            <w:tcW w:type="dxa" w:w="2244"/>
-            <w:tcBorders>
-              <w:top w:val="single" w:sz="6" w:color="000000"/>
-              <w:left w:val="single" w:sz="6" w:color="000000"/>
-              <w:bottom w:val="single" w:sz="6" w:color="000000"/>
-              <w:right w:val="single" w:sz="6" w:color="000000"/>
-            </w:tcBorders>
+              <w:spacing w:before="60" w:after="60"/>
+              <w:jc w:val="left"/>
+            </w:pPr>
+            <w:r>
+              <w:rPr>
+                <w:rFonts w:ascii="Times New Roman" w:hAnsi="Times New Roman"/>
+                <w:b w:val="0"/>
+                <w:color w:val="000000"/>
+                <w:sz w:val="18"/>
+              </w:rPr>
+              <w:t>Realengo II</w:t>
+            </w:r>
+          </w:p>
+        </w:tc>
+        <w:tc>
+          <w:tcPr>
+            <w:tcW w:type="dxa" w:w="907"/>
+            <w:vAlign w:val="center"/>
             <w:shd w:fill="DEEAF6"/>
           </w:tcPr>
           <w:p>
             <w:pPr>
-              <w:spacing w:after="60" w:before="60"/>
-            </w:pPr>
-            <w:r>
-              <w:rPr>
-                <w:rFonts w:ascii="Times New Roman" w:hAnsi="Times New Roman"/>
-                <w:color w:val="000000"/>
-                <w:sz w:val="16"/>
-              </w:rPr>
-              <w:t>155630</w:t>
-            </w:r>
-          </w:p>
-        </w:tc>
-        <w:tc>
-          <w:tcPr>
-            <w:tcW w:type="dxa" w:w="2245"/>
-            <w:tcBorders>
-              <w:top w:val="single" w:sz="6" w:color="000000"/>
-              <w:left w:val="single" w:sz="6" w:color="000000"/>
-              <w:bottom w:val="single" w:sz="6" w:color="000000"/>
-              <w:right w:val="single" w:sz="6" w:color="000000"/>
-            </w:tcBorders>
+              <w:spacing w:before="60" w:after="60"/>
+              <w:jc w:val="center"/>
+            </w:pPr>
+            <w:r>
+              <w:rPr>
+                <w:rFonts w:ascii="Times New Roman" w:hAnsi="Times New Roman"/>
+                <w:b w:val="0"/>
+                <w:color w:val="000000"/>
+                <w:sz w:val="18"/>
+              </w:rPr>
+              <w:t>155627</w:t>
+            </w:r>
+          </w:p>
+        </w:tc>
+        <w:tc>
+          <w:tcPr>
+            <w:tcW w:type="dxa" w:w="850"/>
+            <w:vAlign w:val="center"/>
             <w:shd w:fill="DEEAF6"/>
           </w:tcPr>
           <w:p>
             <w:pPr>
-              <w:spacing w:after="60" w:before="60"/>
-            </w:pPr>
-            <w:r>
-              <w:rPr>
-                <w:rFonts w:ascii="Times New Roman" w:hAnsi="Times New Roman"/>
-                <w:color w:val="000000"/>
-                <w:sz w:val="16"/>
+              <w:spacing w:before="60" w:after="60"/>
+              <w:jc w:val="center"/>
+            </w:pPr>
+            <w:r>
+              <w:rPr>
+                <w:rFonts w:ascii="Times New Roman" w:hAnsi="Times New Roman"/>
+                <w:b w:val="0"/>
+                <w:color w:val="000000"/>
+                <w:sz w:val="18"/>
               </w:rPr>
               <w:t>Diária</w:t>
             </w:r>
@@ -1935,25 +2044,89 @@
         </w:tc>
         <w:tc>
           <w:tcPr>
-            <w:tcW w:type="dxa" w:w="2245"/>
-            <w:tcBorders>
-              <w:top w:val="single" w:sz="6" w:color="000000"/>
-              <w:left w:val="single" w:sz="6" w:color="000000"/>
-              <w:bottom w:val="single" w:sz="6" w:color="000000"/>
-              <w:right w:val="single" w:sz="6" w:color="000000"/>
-            </w:tcBorders>
+            <w:tcW w:type="dxa" w:w="1006"/>
+            <w:vAlign w:val="center"/>
             <w:shd w:fill="DEEAF6"/>
           </w:tcPr>
           <w:p>
             <w:pPr>
+              <w:spacing w:before="60" w:after="60"/>
               <w:jc w:val="center"/>
             </w:pPr>
             <w:r>
               <w:rPr>
-                <w:rFonts w:ascii="Consolas" w:hAnsi="Consolas"/>
-                <w:sz w:val="16"/>
-              </w:rPr>
-              <w:t>0 | 5 | 15 | 0</w:t>
+                <w:rFonts w:ascii="Times New Roman" w:hAnsi="Times New Roman"/>
+                <w:b w:val="0"/>
+                <w:color w:val="000000"/>
+                <w:sz w:val="18"/>
+              </w:rPr>
+              <w:t>30</w:t>
+            </w:r>
+          </w:p>
+        </w:tc>
+        <w:tc>
+          <w:tcPr>
+            <w:tcW w:type="dxa" w:w="1006"/>
+            <w:vAlign w:val="center"/>
+            <w:shd w:fill="DEEAF6"/>
+          </w:tcPr>
+          <w:p>
+            <w:pPr>
+              <w:spacing w:before="60" w:after="60"/>
+              <w:jc w:val="center"/>
+            </w:pPr>
+            <w:r>
+              <w:rPr>
+                <w:rFonts w:ascii="Times New Roman" w:hAnsi="Times New Roman"/>
+                <w:b w:val="0"/>
+                <w:color w:val="000000"/>
+                <w:sz w:val="18"/>
+              </w:rPr>
+              <w:t>30</w:t>
+            </w:r>
+          </w:p>
+        </w:tc>
+        <w:tc>
+          <w:tcPr>
+            <w:tcW w:type="dxa" w:w="1006"/>
+            <w:vAlign w:val="center"/>
+            <w:shd w:fill="DEEAF6"/>
+          </w:tcPr>
+          <w:p>
+            <w:pPr>
+              <w:spacing w:before="60" w:after="60"/>
+              <w:jc w:val="center"/>
+            </w:pPr>
+            <w:r>
+              <w:rPr>
+                <w:rFonts w:ascii="Times New Roman" w:hAnsi="Times New Roman"/>
+                <w:b w:val="0"/>
+                <w:color w:val="000000"/>
+                <w:sz w:val="18"/>
+              </w:rPr>
+              <w:t>30</w:t>
+            </w:r>
+          </w:p>
+        </w:tc>
+        <w:tc>
+          <w:tcPr>
+            <w:tcW w:type="dxa" w:w="1006"/>
+            <w:vAlign w:val="center"/>
+            <w:shd w:fill="DEEAF6"/>
+          </w:tcPr>
+          <w:p>
+            <w:pPr>
+              <w:spacing w:before="60" w:after="60"/>
+              <w:jc w:val="center"/>
+            </w:pPr>
+            <w:r>
+              <w:rPr>
+                <w:rFonts w:ascii="Times New Roman" w:hAnsi="Times New Roman"/>
+                <w:b w:val="0"/>
+                <w:color w:val="000000"/>
+                <w:sz w:val="18"/>
+              </w:rPr>
+              <w:t>5</w:t>
             </w:r>
           </w:p>
         </w:tc>
@@ -1961,78 +2134,68 @@
       <w:tr>
         <w:trPr>
           <w:cantSplit/>
-          <w:cantSplit/>
         </w:trPr>
         <w:tc>
           <w:tcPr>
-            <w:tcW w:type="dxa" w:w="2244"/>
-            <w:tcBorders>
-              <w:top w:val="single" w:sz="6" w:color="000000"/>
-              <w:left w:val="single" w:sz="6" w:color="000000"/>
-              <w:bottom w:val="single" w:sz="6" w:color="000000"/>
-              <w:right w:val="single" w:sz="6" w:color="000000"/>
-            </w:tcBorders>
+            <w:tcW w:type="dxa" w:w="3175"/>
+            <w:vAlign w:val="center"/>
             <w:shd w:fill="DEEAF6"/>
           </w:tcPr>
           <w:p>
             <w:pPr>
-              <w:spacing w:after="60" w:before="60"/>
-            </w:pPr>
-            <w:r>
-              <w:rPr>
-                <w:rFonts w:ascii="Times New Roman" w:hAnsi="Times New Roman"/>
-                <w:color w:val="000000"/>
-                <w:sz w:val="16"/>
-              </w:rPr>
-              <w:t>São Cristóvão II</w:t>
-            </w:r>
-          </w:p>
-        </w:tc>
-        <w:tc>
-          <w:tcPr>
-            <w:tcW w:type="dxa" w:w="2244"/>
-            <w:tcBorders>
-              <w:top w:val="single" w:sz="6" w:color="000000"/>
-              <w:left w:val="single" w:sz="6" w:color="000000"/>
-              <w:bottom w:val="single" w:sz="6" w:color="000000"/>
-              <w:right w:val="single" w:sz="6" w:color="000000"/>
-            </w:tcBorders>
+              <w:spacing w:before="60" w:after="60"/>
+              <w:jc w:val="left"/>
+            </w:pPr>
+            <w:r>
+              <w:rPr>
+                <w:rFonts w:ascii="Times New Roman" w:hAnsi="Times New Roman"/>
+                <w:b w:val="0"/>
+                <w:color w:val="000000"/>
+                <w:sz w:val="18"/>
+              </w:rPr>
+              <w:t>São Cristóvão I</w:t>
+            </w:r>
+          </w:p>
+        </w:tc>
+        <w:tc>
+          <w:tcPr>
+            <w:tcW w:type="dxa" w:w="907"/>
+            <w:vAlign w:val="center"/>
             <w:shd w:fill="DEEAF6"/>
           </w:tcPr>
           <w:p>
             <w:pPr>
-              <w:spacing w:after="60" w:before="60"/>
-            </w:pPr>
-            <w:r>
-              <w:rPr>
-                <w:rFonts w:ascii="Times New Roman" w:hAnsi="Times New Roman"/>
-                <w:color w:val="000000"/>
-                <w:sz w:val="16"/>
-              </w:rPr>
-              <w:t>155631</w:t>
-            </w:r>
-          </w:p>
-        </w:tc>
-        <w:tc>
-          <w:tcPr>
-            <w:tcW w:type="dxa" w:w="2245"/>
-            <w:tcBorders>
-              <w:top w:val="single" w:sz="6" w:color="000000"/>
-              <w:left w:val="single" w:sz="6" w:color="000000"/>
-              <w:bottom w:val="single" w:sz="6" w:color="000000"/>
-              <w:right w:val="single" w:sz="6" w:color="000000"/>
-            </w:tcBorders>
+              <w:spacing w:before="60" w:after="60"/>
+              <w:jc w:val="center"/>
+            </w:pPr>
+            <w:r>
+              <w:rPr>
+                <w:rFonts w:ascii="Times New Roman" w:hAnsi="Times New Roman"/>
+                <w:b w:val="0"/>
+                <w:color w:val="000000"/>
+                <w:sz w:val="18"/>
+              </w:rPr>
+              <w:t>155630</w:t>
+            </w:r>
+          </w:p>
+        </w:tc>
+        <w:tc>
+          <w:tcPr>
+            <w:tcW w:type="dxa" w:w="850"/>
+            <w:vAlign w:val="center"/>
             <w:shd w:fill="DEEAF6"/>
           </w:tcPr>
           <w:p>
             <w:pPr>
-              <w:spacing w:after="60" w:before="60"/>
-            </w:pPr>
-            <w:r>
-              <w:rPr>
-                <w:rFonts w:ascii="Times New Roman" w:hAnsi="Times New Roman"/>
-                <w:color w:val="000000"/>
-                <w:sz w:val="16"/>
+              <w:spacing w:before="60" w:after="60"/>
+              <w:jc w:val="center"/>
+            </w:pPr>
+            <w:r>
+              <w:rPr>
+                <w:rFonts w:ascii="Times New Roman" w:hAnsi="Times New Roman"/>
+                <w:b w:val="0"/>
+                <w:color w:val="000000"/>
+                <w:sz w:val="18"/>
               </w:rPr>
               <w:t>Diária</w:t>
             </w:r>
@@ -2040,25 +2203,89 @@
         </w:tc>
         <w:tc>
           <w:tcPr>
-            <w:tcW w:type="dxa" w:w="2245"/>
-            <w:tcBorders>
-              <w:top w:val="single" w:sz="6" w:color="000000"/>
-              <w:left w:val="single" w:sz="6" w:color="000000"/>
-              <w:bottom w:val="single" w:sz="6" w:color="000000"/>
-              <w:right w:val="single" w:sz="6" w:color="000000"/>
-            </w:tcBorders>
+            <w:tcW w:type="dxa" w:w="1006"/>
+            <w:vAlign w:val="center"/>
             <w:shd w:fill="DEEAF6"/>
           </w:tcPr>
           <w:p>
             <w:pPr>
+              <w:spacing w:before="60" w:after="60"/>
               <w:jc w:val="center"/>
             </w:pPr>
             <w:r>
               <w:rPr>
-                <w:rFonts w:ascii="Consolas" w:hAnsi="Consolas"/>
-                <w:sz w:val="16"/>
-              </w:rPr>
-              <w:t>150 | 150 | 150 | 150</w:t>
+                <w:rFonts w:ascii="Times New Roman" w:hAnsi="Times New Roman"/>
+                <w:b w:val="0"/>
+                <w:color w:val="000000"/>
+                <w:sz w:val="18"/>
+              </w:rPr>
+              <w:t>0</w:t>
+            </w:r>
+          </w:p>
+        </w:tc>
+        <w:tc>
+          <w:tcPr>
+            <w:tcW w:type="dxa" w:w="1006"/>
+            <w:vAlign w:val="center"/>
+            <w:shd w:fill="DEEAF6"/>
+          </w:tcPr>
+          <w:p>
+            <w:pPr>
+              <w:spacing w:before="60" w:after="60"/>
+              <w:jc w:val="center"/>
+            </w:pPr>
+            <w:r>
+              <w:rPr>
+                <w:rFonts w:ascii="Times New Roman" w:hAnsi="Times New Roman"/>
+                <w:b w:val="0"/>
+                <w:color w:val="000000"/>
+                <w:sz w:val="18"/>
+              </w:rPr>
+              <w:t>5</w:t>
+            </w:r>
+          </w:p>
+        </w:tc>
+        <w:tc>
+          <w:tcPr>
+            <w:tcW w:type="dxa" w:w="1006"/>
+            <w:vAlign w:val="center"/>
+            <w:shd w:fill="DEEAF6"/>
+          </w:tcPr>
+          <w:p>
+            <w:pPr>
+              <w:spacing w:before="60" w:after="60"/>
+              <w:jc w:val="center"/>
+            </w:pPr>
+            <w:r>
+              <w:rPr>
+                <w:rFonts w:ascii="Times New Roman" w:hAnsi="Times New Roman"/>
+                <w:b w:val="0"/>
+                <w:color w:val="000000"/>
+                <w:sz w:val="18"/>
+              </w:rPr>
+              <w:t>15</w:t>
+            </w:r>
+          </w:p>
+        </w:tc>
+        <w:tc>
+          <w:tcPr>
+            <w:tcW w:type="dxa" w:w="1006"/>
+            <w:vAlign w:val="center"/>
+            <w:shd w:fill="DEEAF6"/>
+          </w:tcPr>
+          <w:p>
+            <w:pPr>
+              <w:spacing w:before="60" w:after="60"/>
+              <w:jc w:val="center"/>
+            </w:pPr>
+            <w:r>
+              <w:rPr>
+                <w:rFonts w:ascii="Times New Roman" w:hAnsi="Times New Roman"/>
+                <w:b w:val="0"/>
+                <w:color w:val="000000"/>
+                <w:sz w:val="18"/>
+              </w:rPr>
+              <w:t>0</w:t>
             </w:r>
           </w:p>
         </w:tc>
@@ -2066,78 +2293,68 @@
       <w:tr>
         <w:trPr>
           <w:cantSplit/>
-          <w:cantSplit/>
         </w:trPr>
         <w:tc>
           <w:tcPr>
-            <w:tcW w:type="dxa" w:w="2244"/>
-            <w:tcBorders>
-              <w:top w:val="single" w:sz="6" w:color="000000"/>
-              <w:left w:val="single" w:sz="6" w:color="000000"/>
-              <w:bottom w:val="single" w:sz="6" w:color="000000"/>
-              <w:right w:val="single" w:sz="6" w:color="000000"/>
-            </w:tcBorders>
+            <w:tcW w:type="dxa" w:w="3175"/>
+            <w:vAlign w:val="center"/>
             <w:shd w:fill="DEEAF6"/>
           </w:tcPr>
           <w:p>
             <w:pPr>
-              <w:spacing w:after="60" w:before="60"/>
-            </w:pPr>
-            <w:r>
-              <w:rPr>
-                <w:rFonts w:ascii="Times New Roman" w:hAnsi="Times New Roman"/>
-                <w:color w:val="000000"/>
-                <w:sz w:val="16"/>
-              </w:rPr>
-              <w:t>São Cristóvão III</w:t>
-            </w:r>
-          </w:p>
-        </w:tc>
-        <w:tc>
-          <w:tcPr>
-            <w:tcW w:type="dxa" w:w="2244"/>
-            <w:tcBorders>
-              <w:top w:val="single" w:sz="6" w:color="000000"/>
-              <w:left w:val="single" w:sz="6" w:color="000000"/>
-              <w:bottom w:val="single" w:sz="6" w:color="000000"/>
-              <w:right w:val="single" w:sz="6" w:color="000000"/>
-            </w:tcBorders>
+              <w:spacing w:before="60" w:after="60"/>
+              <w:jc w:val="left"/>
+            </w:pPr>
+            <w:r>
+              <w:rPr>
+                <w:rFonts w:ascii="Times New Roman" w:hAnsi="Times New Roman"/>
+                <w:b w:val="0"/>
+                <w:color w:val="000000"/>
+                <w:sz w:val="18"/>
+              </w:rPr>
+              <w:t>São Cristóvão II</w:t>
+            </w:r>
+          </w:p>
+        </w:tc>
+        <w:tc>
+          <w:tcPr>
+            <w:tcW w:type="dxa" w:w="907"/>
+            <w:vAlign w:val="center"/>
             <w:shd w:fill="DEEAF6"/>
           </w:tcPr>
           <w:p>
             <w:pPr>
-              <w:spacing w:after="60" w:before="60"/>
-            </w:pPr>
-            <w:r>
-              <w:rPr>
-                <w:rFonts w:ascii="Times New Roman" w:hAnsi="Times New Roman"/>
-                <w:color w:val="000000"/>
-                <w:sz w:val="16"/>
-              </w:rPr>
-              <w:t>155632</w:t>
-            </w:r>
-          </w:p>
-        </w:tc>
-        <w:tc>
-          <w:tcPr>
-            <w:tcW w:type="dxa" w:w="2245"/>
-            <w:tcBorders>
-              <w:top w:val="single" w:sz="6" w:color="000000"/>
-              <w:left w:val="single" w:sz="6" w:color="000000"/>
-              <w:bottom w:val="single" w:sz="6" w:color="000000"/>
-              <w:right w:val="single" w:sz="6" w:color="000000"/>
-            </w:tcBorders>
+              <w:spacing w:before="60" w:after="60"/>
+              <w:jc w:val="center"/>
+            </w:pPr>
+            <w:r>
+              <w:rPr>
+                <w:rFonts w:ascii="Times New Roman" w:hAnsi="Times New Roman"/>
+                <w:b w:val="0"/>
+                <w:color w:val="000000"/>
+                <w:sz w:val="18"/>
+              </w:rPr>
+              <w:t>155631</w:t>
+            </w:r>
+          </w:p>
+        </w:tc>
+        <w:tc>
+          <w:tcPr>
+            <w:tcW w:type="dxa" w:w="850"/>
+            <w:vAlign w:val="center"/>
             <w:shd w:fill="DEEAF6"/>
           </w:tcPr>
           <w:p>
             <w:pPr>
-              <w:spacing w:after="60" w:before="60"/>
-            </w:pPr>
-            <w:r>
-              <w:rPr>
-                <w:rFonts w:ascii="Times New Roman" w:hAnsi="Times New Roman"/>
-                <w:color w:val="000000"/>
-                <w:sz w:val="16"/>
+              <w:spacing w:before="60" w:after="60"/>
+              <w:jc w:val="center"/>
+            </w:pPr>
+            <w:r>
+              <w:rPr>
+                <w:rFonts w:ascii="Times New Roman" w:hAnsi="Times New Roman"/>
+                <w:b w:val="0"/>
+                <w:color w:val="000000"/>
+                <w:sz w:val="18"/>
               </w:rPr>
               <w:t>Diária</w:t>
             </w:r>
@@ -2145,25 +2362,89 @@
         </w:tc>
         <w:tc>
           <w:tcPr>
-            <w:tcW w:type="dxa" w:w="2245"/>
-            <w:tcBorders>
-              <w:top w:val="single" w:sz="6" w:color="000000"/>
-              <w:left w:val="single" w:sz="6" w:color="000000"/>
-              <w:bottom w:val="single" w:sz="6" w:color="000000"/>
-              <w:right w:val="single" w:sz="6" w:color="000000"/>
-            </w:tcBorders>
+            <w:tcW w:type="dxa" w:w="1006"/>
+            <w:vAlign w:val="center"/>
             <w:shd w:fill="DEEAF6"/>
           </w:tcPr>
           <w:p>
             <w:pPr>
+              <w:spacing w:before="60" w:after="60"/>
               <w:jc w:val="center"/>
             </w:pPr>
             <w:r>
               <w:rPr>
-                <w:rFonts w:ascii="Consolas" w:hAnsi="Consolas"/>
-                <w:sz w:val="16"/>
-              </w:rPr>
-              <w:t>5 | 5 | 10 | 4</w:t>
+                <w:rFonts w:ascii="Times New Roman" w:hAnsi="Times New Roman"/>
+                <w:b w:val="0"/>
+                <w:color w:val="000000"/>
+                <w:sz w:val="18"/>
+              </w:rPr>
+              <w:t>150</w:t>
+            </w:r>
+          </w:p>
+        </w:tc>
+        <w:tc>
+          <w:tcPr>
+            <w:tcW w:type="dxa" w:w="1006"/>
+            <w:vAlign w:val="center"/>
+            <w:shd w:fill="DEEAF6"/>
+          </w:tcPr>
+          <w:p>
+            <w:pPr>
+              <w:spacing w:before="60" w:after="60"/>
+              <w:jc w:val="center"/>
+            </w:pPr>
+            <w:r>
+              <w:rPr>
+                <w:rFonts w:ascii="Times New Roman" w:hAnsi="Times New Roman"/>
+                <w:b w:val="0"/>
+                <w:color w:val="000000"/>
+                <w:sz w:val="18"/>
+              </w:rPr>
+              <w:t>150</w:t>
+            </w:r>
+          </w:p>
+        </w:tc>
+        <w:tc>
+          <w:tcPr>
+            <w:tcW w:type="dxa" w:w="1006"/>
+            <w:vAlign w:val="center"/>
+            <w:shd w:fill="DEEAF6"/>
+          </w:tcPr>
+          <w:p>
+            <w:pPr>
+              <w:spacing w:before="60" w:after="60"/>
+              <w:jc w:val="center"/>
+            </w:pPr>
+            <w:r>
+              <w:rPr>
+                <w:rFonts w:ascii="Times New Roman" w:hAnsi="Times New Roman"/>
+                <w:b w:val="0"/>
+                <w:color w:val="000000"/>
+                <w:sz w:val="18"/>
+              </w:rPr>
+              <w:t>150</w:t>
+            </w:r>
+          </w:p>
+        </w:tc>
+        <w:tc>
+          <w:tcPr>
+            <w:tcW w:type="dxa" w:w="1006"/>
+            <w:vAlign w:val="center"/>
+            <w:shd w:fill="DEEAF6"/>
+          </w:tcPr>
+          <w:p>
+            <w:pPr>
+              <w:spacing w:before="60" w:after="60"/>
+              <w:jc w:val="center"/>
+            </w:pPr>
+            <w:r>
+              <w:rPr>
+                <w:rFonts w:ascii="Times New Roman" w:hAnsi="Times New Roman"/>
+                <w:b w:val="0"/>
+                <w:color w:val="000000"/>
+                <w:sz w:val="18"/>
+              </w:rPr>
+              <w:t>150</w:t>
             </w:r>
           </w:p>
         </w:tc>
@@ -2171,78 +2452,68 @@
       <w:tr>
         <w:trPr>
           <w:cantSplit/>
-          <w:cantSplit/>
         </w:trPr>
         <w:tc>
           <w:tcPr>
-            <w:tcW w:type="dxa" w:w="2244"/>
-            <w:tcBorders>
-              <w:top w:val="single" w:sz="6" w:color="000000"/>
-              <w:left w:val="single" w:sz="6" w:color="000000"/>
-              <w:bottom w:val="single" w:sz="6" w:color="000000"/>
-              <w:right w:val="single" w:sz="6" w:color="000000"/>
-            </w:tcBorders>
+            <w:tcW w:type="dxa" w:w="3175"/>
+            <w:vAlign w:val="center"/>
             <w:shd w:fill="DEEAF6"/>
           </w:tcPr>
           <w:p>
             <w:pPr>
-              <w:spacing w:after="60" w:before="60"/>
-            </w:pPr>
-            <w:r>
-              <w:rPr>
-                <w:rFonts w:ascii="Times New Roman" w:hAnsi="Times New Roman"/>
-                <w:color w:val="000000"/>
-                <w:sz w:val="16"/>
-              </w:rPr>
-              <w:t>Centro</w:t>
-            </w:r>
-          </w:p>
-        </w:tc>
-        <w:tc>
-          <w:tcPr>
-            <w:tcW w:type="dxa" w:w="2244"/>
-            <w:tcBorders>
-              <w:top w:val="single" w:sz="6" w:color="000000"/>
-              <w:left w:val="single" w:sz="6" w:color="000000"/>
-              <w:bottom w:val="single" w:sz="6" w:color="000000"/>
-              <w:right w:val="single" w:sz="6" w:color="000000"/>
-            </w:tcBorders>
+              <w:spacing w:before="60" w:after="60"/>
+              <w:jc w:val="left"/>
+            </w:pPr>
+            <w:r>
+              <w:rPr>
+                <w:rFonts w:ascii="Times New Roman" w:hAnsi="Times New Roman"/>
+                <w:b w:val="0"/>
+                <w:color w:val="000000"/>
+                <w:sz w:val="18"/>
+              </w:rPr>
+              <w:t>São Cristóvão III</w:t>
+            </w:r>
+          </w:p>
+        </w:tc>
+        <w:tc>
+          <w:tcPr>
+            <w:tcW w:type="dxa" w:w="907"/>
+            <w:vAlign w:val="center"/>
             <w:shd w:fill="DEEAF6"/>
           </w:tcPr>
           <w:p>
             <w:pPr>
-              <w:spacing w:after="60" w:before="60"/>
-            </w:pPr>
-            <w:r>
-              <w:rPr>
-                <w:rFonts w:ascii="Times New Roman" w:hAnsi="Times New Roman"/>
-                <w:color w:val="000000"/>
-                <w:sz w:val="16"/>
-              </w:rPr>
-              <w:t>155628</w:t>
-            </w:r>
-          </w:p>
-        </w:tc>
-        <w:tc>
-          <w:tcPr>
-            <w:tcW w:type="dxa" w:w="2245"/>
-            <w:tcBorders>
-              <w:top w:val="single" w:sz="6" w:color="000000"/>
-              <w:left w:val="single" w:sz="6" w:color="000000"/>
-              <w:bottom w:val="single" w:sz="6" w:color="000000"/>
-              <w:right w:val="single" w:sz="6" w:color="000000"/>
-            </w:tcBorders>
+              <w:spacing w:before="60" w:after="60"/>
+              <w:jc w:val="center"/>
+            </w:pPr>
+            <w:r>
+              <w:rPr>
+                <w:rFonts w:ascii="Times New Roman" w:hAnsi="Times New Roman"/>
+                <w:b w:val="0"/>
+                <w:color w:val="000000"/>
+                <w:sz w:val="18"/>
+              </w:rPr>
+              <w:t>155632</w:t>
+            </w:r>
+          </w:p>
+        </w:tc>
+        <w:tc>
+          <w:tcPr>
+            <w:tcW w:type="dxa" w:w="850"/>
+            <w:vAlign w:val="center"/>
             <w:shd w:fill="DEEAF6"/>
           </w:tcPr>
           <w:p>
             <w:pPr>
-              <w:spacing w:after="60" w:before="60"/>
-            </w:pPr>
-            <w:r>
-              <w:rPr>
-                <w:rFonts w:ascii="Times New Roman" w:hAnsi="Times New Roman"/>
-                <w:color w:val="000000"/>
-                <w:sz w:val="16"/>
+              <w:spacing w:before="60" w:after="60"/>
+              <w:jc w:val="center"/>
+            </w:pPr>
+            <w:r>
+              <w:rPr>
+                <w:rFonts w:ascii="Times New Roman" w:hAnsi="Times New Roman"/>
+                <w:b w:val="0"/>
+                <w:color w:val="000000"/>
+                <w:sz w:val="18"/>
               </w:rPr>
               <w:t>Diária</w:t>
             </w:r>
@@ -2250,25 +2521,89 @@
         </w:tc>
         <w:tc>
           <w:tcPr>
-            <w:tcW w:type="dxa" w:w="2245"/>
-            <w:tcBorders>
-              <w:top w:val="single" w:sz="6" w:color="000000"/>
-              <w:left w:val="single" w:sz="6" w:color="000000"/>
-              <w:bottom w:val="single" w:sz="6" w:color="000000"/>
-              <w:right w:val="single" w:sz="6" w:color="000000"/>
-            </w:tcBorders>
+            <w:tcW w:type="dxa" w:w="1006"/>
+            <w:vAlign w:val="center"/>
             <w:shd w:fill="DEEAF6"/>
           </w:tcPr>
           <w:p>
             <w:pPr>
+              <w:spacing w:before="60" w:after="60"/>
               <w:jc w:val="center"/>
             </w:pPr>
             <w:r>
               <w:rPr>
-                <w:rFonts w:ascii="Consolas" w:hAnsi="Consolas"/>
-                <w:sz w:val="16"/>
-              </w:rPr>
-              <w:t>65 | 25 | 40 | 30</w:t>
+                <w:rFonts w:ascii="Times New Roman" w:hAnsi="Times New Roman"/>
+                <w:b w:val="0"/>
+                <w:color w:val="000000"/>
+                <w:sz w:val="18"/>
+              </w:rPr>
+              <w:t>5</w:t>
+            </w:r>
+          </w:p>
+        </w:tc>
+        <w:tc>
+          <w:tcPr>
+            <w:tcW w:type="dxa" w:w="1006"/>
+            <w:vAlign w:val="center"/>
+            <w:shd w:fill="DEEAF6"/>
+          </w:tcPr>
+          <w:p>
+            <w:pPr>
+              <w:spacing w:before="60" w:after="60"/>
+              <w:jc w:val="center"/>
+            </w:pPr>
+            <w:r>
+              <w:rPr>
+                <w:rFonts w:ascii="Times New Roman" w:hAnsi="Times New Roman"/>
+                <w:b w:val="0"/>
+                <w:color w:val="000000"/>
+                <w:sz w:val="18"/>
+              </w:rPr>
+              <w:t>5</w:t>
+            </w:r>
+          </w:p>
+        </w:tc>
+        <w:tc>
+          <w:tcPr>
+            <w:tcW w:type="dxa" w:w="1006"/>
+            <w:vAlign w:val="center"/>
+            <w:shd w:fill="DEEAF6"/>
+          </w:tcPr>
+          <w:p>
+            <w:pPr>
+              <w:spacing w:before="60" w:after="60"/>
+              <w:jc w:val="center"/>
+            </w:pPr>
+            <w:r>
+              <w:rPr>
+                <w:rFonts w:ascii="Times New Roman" w:hAnsi="Times New Roman"/>
+                <w:b w:val="0"/>
+                <w:color w:val="000000"/>
+                <w:sz w:val="18"/>
+              </w:rPr>
+              <w:t>10</w:t>
+            </w:r>
+          </w:p>
+        </w:tc>
+        <w:tc>
+          <w:tcPr>
+            <w:tcW w:type="dxa" w:w="1006"/>
+            <w:vAlign w:val="center"/>
+            <w:shd w:fill="DEEAF6"/>
+          </w:tcPr>
+          <w:p>
+            <w:pPr>
+              <w:spacing w:before="60" w:after="60"/>
+              <w:jc w:val="center"/>
+            </w:pPr>
+            <w:r>
+              <w:rPr>
+                <w:rFonts w:ascii="Times New Roman" w:hAnsi="Times New Roman"/>
+                <w:b w:val="0"/>
+                <w:color w:val="000000"/>
+                <w:sz w:val="18"/>
+              </w:rPr>
+              <w:t>4</w:t>
             </w:r>
           </w:p>
         </w:tc>
@@ -2276,78 +2611,68 @@
       <w:tr>
         <w:trPr>
           <w:cantSplit/>
-          <w:cantSplit/>
         </w:trPr>
         <w:tc>
           <w:tcPr>
-            <w:tcW w:type="dxa" w:w="2244"/>
-            <w:tcBorders>
-              <w:top w:val="single" w:sz="6" w:color="000000"/>
-              <w:left w:val="single" w:sz="6" w:color="000000"/>
-              <w:bottom w:val="single" w:sz="6" w:color="000000"/>
-              <w:right w:val="single" w:sz="6" w:color="000000"/>
-            </w:tcBorders>
+            <w:tcW w:type="dxa" w:w="3175"/>
+            <w:vAlign w:val="center"/>
             <w:shd w:fill="DEEAF6"/>
           </w:tcPr>
           <w:p>
             <w:pPr>
-              <w:spacing w:after="60" w:before="60"/>
-            </w:pPr>
-            <w:r>
-              <w:rPr>
-                <w:rFonts w:ascii="Times New Roman" w:hAnsi="Times New Roman"/>
-                <w:color w:val="000000"/>
-                <w:sz w:val="16"/>
-              </w:rPr>
-              <w:t>Duque de Caxias</w:t>
-            </w:r>
-          </w:p>
-        </w:tc>
-        <w:tc>
-          <w:tcPr>
-            <w:tcW w:type="dxa" w:w="2244"/>
-            <w:tcBorders>
-              <w:top w:val="single" w:sz="6" w:color="000000"/>
-              <w:left w:val="single" w:sz="6" w:color="000000"/>
-              <w:bottom w:val="single" w:sz="6" w:color="000000"/>
-              <w:right w:val="single" w:sz="6" w:color="000000"/>
-            </w:tcBorders>
+              <w:spacing w:before="60" w:after="60"/>
+              <w:jc w:val="left"/>
+            </w:pPr>
+            <w:r>
+              <w:rPr>
+                <w:rFonts w:ascii="Times New Roman" w:hAnsi="Times New Roman"/>
+                <w:b w:val="0"/>
+                <w:color w:val="000000"/>
+                <w:sz w:val="18"/>
+              </w:rPr>
+              <w:t>Centro</w:t>
+            </w:r>
+          </w:p>
+        </w:tc>
+        <w:tc>
+          <w:tcPr>
+            <w:tcW w:type="dxa" w:w="907"/>
+            <w:vAlign w:val="center"/>
             <w:shd w:fill="DEEAF6"/>
           </w:tcPr>
           <w:p>
             <w:pPr>
-              <w:spacing w:after="60" w:before="60"/>
-            </w:pPr>
-            <w:r>
-              <w:rPr>
-                <w:rFonts w:ascii="Times New Roman" w:hAnsi="Times New Roman"/>
-                <w:color w:val="000000"/>
-                <w:sz w:val="16"/>
-              </w:rPr>
-              <w:t>155637</w:t>
-            </w:r>
-          </w:p>
-        </w:tc>
-        <w:tc>
-          <w:tcPr>
-            <w:tcW w:type="dxa" w:w="2245"/>
-            <w:tcBorders>
-              <w:top w:val="single" w:sz="6" w:color="000000"/>
-              <w:left w:val="single" w:sz="6" w:color="000000"/>
-              <w:bottom w:val="single" w:sz="6" w:color="000000"/>
-              <w:right w:val="single" w:sz="6" w:color="000000"/>
-            </w:tcBorders>
+              <w:spacing w:before="60" w:after="60"/>
+              <w:jc w:val="center"/>
+            </w:pPr>
+            <w:r>
+              <w:rPr>
+                <w:rFonts w:ascii="Times New Roman" w:hAnsi="Times New Roman"/>
+                <w:b w:val="0"/>
+                <w:color w:val="000000"/>
+                <w:sz w:val="18"/>
+              </w:rPr>
+              <w:t>155628</w:t>
+            </w:r>
+          </w:p>
+        </w:tc>
+        <w:tc>
+          <w:tcPr>
+            <w:tcW w:type="dxa" w:w="850"/>
+            <w:vAlign w:val="center"/>
             <w:shd w:fill="DEEAF6"/>
           </w:tcPr>
           <w:p>
             <w:pPr>
-              <w:spacing w:after="60" w:before="60"/>
-            </w:pPr>
-            <w:r>
-              <w:rPr>
-                <w:rFonts w:ascii="Times New Roman" w:hAnsi="Times New Roman"/>
-                <w:color w:val="000000"/>
-                <w:sz w:val="16"/>
+              <w:spacing w:before="60" w:after="60"/>
+              <w:jc w:val="center"/>
+            </w:pPr>
+            <w:r>
+              <w:rPr>
+                <w:rFonts w:ascii="Times New Roman" w:hAnsi="Times New Roman"/>
+                <w:b w:val="0"/>
+                <w:color w:val="000000"/>
+                <w:sz w:val="18"/>
               </w:rPr>
               <w:t>Diária</w:t>
             </w:r>
@@ -2355,25 +2680,89 @@
         </w:tc>
         <w:tc>
           <w:tcPr>
-            <w:tcW w:type="dxa" w:w="2245"/>
-            <w:tcBorders>
-              <w:top w:val="single" w:sz="6" w:color="000000"/>
-              <w:left w:val="single" w:sz="6" w:color="000000"/>
-              <w:bottom w:val="single" w:sz="6" w:color="000000"/>
-              <w:right w:val="single" w:sz="6" w:color="000000"/>
-            </w:tcBorders>
+            <w:tcW w:type="dxa" w:w="1006"/>
+            <w:vAlign w:val="center"/>
             <w:shd w:fill="DEEAF6"/>
           </w:tcPr>
           <w:p>
             <w:pPr>
+              <w:spacing w:before="60" w:after="60"/>
               <w:jc w:val="center"/>
             </w:pPr>
             <w:r>
               <w:rPr>
-                <w:rFonts w:ascii="Consolas" w:hAnsi="Consolas"/>
-                <w:sz w:val="16"/>
-              </w:rPr>
-              <w:t>150 | 150 | 100 | 100</w:t>
+                <w:rFonts w:ascii="Times New Roman" w:hAnsi="Times New Roman"/>
+                <w:b w:val="0"/>
+                <w:color w:val="000000"/>
+                <w:sz w:val="18"/>
+              </w:rPr>
+              <w:t>65</w:t>
+            </w:r>
+          </w:p>
+        </w:tc>
+        <w:tc>
+          <w:tcPr>
+            <w:tcW w:type="dxa" w:w="1006"/>
+            <w:vAlign w:val="center"/>
+            <w:shd w:fill="DEEAF6"/>
+          </w:tcPr>
+          <w:p>
+            <w:pPr>
+              <w:spacing w:before="60" w:after="60"/>
+              <w:jc w:val="center"/>
+            </w:pPr>
+            <w:r>
+              <w:rPr>
+                <w:rFonts w:ascii="Times New Roman" w:hAnsi="Times New Roman"/>
+                <w:b w:val="0"/>
+                <w:color w:val="000000"/>
+                <w:sz w:val="18"/>
+              </w:rPr>
+              <w:t>25</w:t>
+            </w:r>
+          </w:p>
+        </w:tc>
+        <w:tc>
+          <w:tcPr>
+            <w:tcW w:type="dxa" w:w="1006"/>
+            <w:vAlign w:val="center"/>
+            <w:shd w:fill="DEEAF6"/>
+          </w:tcPr>
+          <w:p>
+            <w:pPr>
+              <w:spacing w:before="60" w:after="60"/>
+              <w:jc w:val="center"/>
+            </w:pPr>
+            <w:r>
+              <w:rPr>
+                <w:rFonts w:ascii="Times New Roman" w:hAnsi="Times New Roman"/>
+                <w:b w:val="0"/>
+                <w:color w:val="000000"/>
+                <w:sz w:val="18"/>
+              </w:rPr>
+              <w:t>40</w:t>
+            </w:r>
+          </w:p>
+        </w:tc>
+        <w:tc>
+          <w:tcPr>
+            <w:tcW w:type="dxa" w:w="1006"/>
+            <w:vAlign w:val="center"/>
+            <w:shd w:fill="DEEAF6"/>
+          </w:tcPr>
+          <w:p>
+            <w:pPr>
+              <w:spacing w:before="60" w:after="60"/>
+              <w:jc w:val="center"/>
+            </w:pPr>
+            <w:r>
+              <w:rPr>
+                <w:rFonts w:ascii="Times New Roman" w:hAnsi="Times New Roman"/>
+                <w:b w:val="0"/>
+                <w:color w:val="000000"/>
+                <w:sz w:val="18"/>
+              </w:rPr>
+              <w:t>30</w:t>
             </w:r>
           </w:p>
         </w:tc>
@@ -2381,78 +2770,68 @@
       <w:tr>
         <w:trPr>
           <w:cantSplit/>
-          <w:cantSplit/>
         </w:trPr>
         <w:tc>
           <w:tcPr>
-            <w:tcW w:type="dxa" w:w="2244"/>
-            <w:tcBorders>
-              <w:top w:val="single" w:sz="6" w:color="000000"/>
-              <w:left w:val="single" w:sz="6" w:color="000000"/>
-              <w:bottom w:val="single" w:sz="6" w:color="000000"/>
-              <w:right w:val="single" w:sz="6" w:color="000000"/>
-            </w:tcBorders>
+            <w:tcW w:type="dxa" w:w="3175"/>
+            <w:vAlign w:val="center"/>
             <w:shd w:fill="DEEAF6"/>
           </w:tcPr>
           <w:p>
             <w:pPr>
-              <w:spacing w:after="60" w:before="60"/>
-            </w:pPr>
-            <w:r>
-              <w:rPr>
-                <w:rFonts w:ascii="Times New Roman" w:hAnsi="Times New Roman"/>
-                <w:color w:val="000000"/>
-                <w:sz w:val="16"/>
-              </w:rPr>
-              <w:t>Humaitá I</w:t>
-            </w:r>
-          </w:p>
-        </w:tc>
-        <w:tc>
-          <w:tcPr>
-            <w:tcW w:type="dxa" w:w="2244"/>
-            <w:tcBorders>
-              <w:top w:val="single" w:sz="6" w:color="000000"/>
-              <w:left w:val="single" w:sz="6" w:color="000000"/>
-              <w:bottom w:val="single" w:sz="6" w:color="000000"/>
-              <w:right w:val="single" w:sz="6" w:color="000000"/>
-            </w:tcBorders>
+              <w:spacing w:before="60" w:after="60"/>
+              <w:jc w:val="left"/>
+            </w:pPr>
+            <w:r>
+              <w:rPr>
+                <w:rFonts w:ascii="Times New Roman" w:hAnsi="Times New Roman"/>
+                <w:b w:val="0"/>
+                <w:color w:val="000000"/>
+                <w:sz w:val="18"/>
+              </w:rPr>
+              <w:t>Duque de Caxias</w:t>
+            </w:r>
+          </w:p>
+        </w:tc>
+        <w:tc>
+          <w:tcPr>
+            <w:tcW w:type="dxa" w:w="907"/>
+            <w:vAlign w:val="center"/>
             <w:shd w:fill="DEEAF6"/>
           </w:tcPr>
           <w:p>
             <w:pPr>
-              <w:spacing w:after="60" w:before="60"/>
-            </w:pPr>
-            <w:r>
-              <w:rPr>
-                <w:rFonts w:ascii="Times New Roman" w:hAnsi="Times New Roman"/>
-                <w:color w:val="000000"/>
-                <w:sz w:val="16"/>
-              </w:rPr>
-              <w:t>155624</w:t>
-            </w:r>
-          </w:p>
-        </w:tc>
-        <w:tc>
-          <w:tcPr>
-            <w:tcW w:type="dxa" w:w="2245"/>
-            <w:tcBorders>
-              <w:top w:val="single" w:sz="6" w:color="000000"/>
-              <w:left w:val="single" w:sz="6" w:color="000000"/>
-              <w:bottom w:val="single" w:sz="6" w:color="000000"/>
-              <w:right w:val="single" w:sz="6" w:color="000000"/>
-            </w:tcBorders>
+              <w:spacing w:before="60" w:after="60"/>
+              <w:jc w:val="center"/>
+            </w:pPr>
+            <w:r>
+              <w:rPr>
+                <w:rFonts w:ascii="Times New Roman" w:hAnsi="Times New Roman"/>
+                <w:b w:val="0"/>
+                <w:color w:val="000000"/>
+                <w:sz w:val="18"/>
+              </w:rPr>
+              <w:t>155637</w:t>
+            </w:r>
+          </w:p>
+        </w:tc>
+        <w:tc>
+          <w:tcPr>
+            <w:tcW w:type="dxa" w:w="850"/>
+            <w:vAlign w:val="center"/>
             <w:shd w:fill="DEEAF6"/>
           </w:tcPr>
           <w:p>
             <w:pPr>
-              <w:spacing w:after="60" w:before="60"/>
-            </w:pPr>
-            <w:r>
-              <w:rPr>
-                <w:rFonts w:ascii="Times New Roman" w:hAnsi="Times New Roman"/>
-                <w:color w:val="000000"/>
-                <w:sz w:val="16"/>
+              <w:spacing w:before="60" w:after="60"/>
+              <w:jc w:val="center"/>
+            </w:pPr>
+            <w:r>
+              <w:rPr>
+                <w:rFonts w:ascii="Times New Roman" w:hAnsi="Times New Roman"/>
+                <w:b w:val="0"/>
+                <w:color w:val="000000"/>
+                <w:sz w:val="18"/>
               </w:rPr>
               <w:t>Diária</w:t>
             </w:r>
@@ -2460,25 +2839,89 @@
         </w:tc>
         <w:tc>
           <w:tcPr>
-            <w:tcW w:type="dxa" w:w="2245"/>
-            <w:tcBorders>
-              <w:top w:val="single" w:sz="6" w:color="000000"/>
-              <w:left w:val="single" w:sz="6" w:color="000000"/>
-              <w:bottom w:val="single" w:sz="6" w:color="000000"/>
-              <w:right w:val="single" w:sz="6" w:color="000000"/>
-            </w:tcBorders>
+            <w:tcW w:type="dxa" w:w="1006"/>
+            <w:vAlign w:val="center"/>
             <w:shd w:fill="DEEAF6"/>
           </w:tcPr>
           <w:p>
             <w:pPr>
+              <w:spacing w:before="60" w:after="60"/>
               <w:jc w:val="center"/>
             </w:pPr>
             <w:r>
               <w:rPr>
-                <w:rFonts w:ascii="Consolas" w:hAnsi="Consolas"/>
-                <w:sz w:val="16"/>
-              </w:rPr>
-              <w:t>20 | 20 | 20 | 25</w:t>
+                <w:rFonts w:ascii="Times New Roman" w:hAnsi="Times New Roman"/>
+                <w:b w:val="0"/>
+                <w:color w:val="000000"/>
+                <w:sz w:val="18"/>
+              </w:rPr>
+              <w:t>150</w:t>
+            </w:r>
+          </w:p>
+        </w:tc>
+        <w:tc>
+          <w:tcPr>
+            <w:tcW w:type="dxa" w:w="1006"/>
+            <w:vAlign w:val="center"/>
+            <w:shd w:fill="DEEAF6"/>
+          </w:tcPr>
+          <w:p>
+            <w:pPr>
+              <w:spacing w:before="60" w:after="60"/>
+              <w:jc w:val="center"/>
+            </w:pPr>
+            <w:r>
+              <w:rPr>
+                <w:rFonts w:ascii="Times New Roman" w:hAnsi="Times New Roman"/>
+                <w:b w:val="0"/>
+                <w:color w:val="000000"/>
+                <w:sz w:val="18"/>
+              </w:rPr>
+              <w:t>150</w:t>
+            </w:r>
+          </w:p>
+        </w:tc>
+        <w:tc>
+          <w:tcPr>
+            <w:tcW w:type="dxa" w:w="1006"/>
+            <w:vAlign w:val="center"/>
+            <w:shd w:fill="DEEAF6"/>
+          </w:tcPr>
+          <w:p>
+            <w:pPr>
+              <w:spacing w:before="60" w:after="60"/>
+              <w:jc w:val="center"/>
+            </w:pPr>
+            <w:r>
+              <w:rPr>
+                <w:rFonts w:ascii="Times New Roman" w:hAnsi="Times New Roman"/>
+                <w:b w:val="0"/>
+                <w:color w:val="000000"/>
+                <w:sz w:val="18"/>
+              </w:rPr>
+              <w:t>100</w:t>
+            </w:r>
+          </w:p>
+        </w:tc>
+        <w:tc>
+          <w:tcPr>
+            <w:tcW w:type="dxa" w:w="1006"/>
+            <w:vAlign w:val="center"/>
+            <w:shd w:fill="DEEAF6"/>
+          </w:tcPr>
+          <w:p>
+            <w:pPr>
+              <w:spacing w:before="60" w:after="60"/>
+              <w:jc w:val="center"/>
+            </w:pPr>
+            <w:r>
+              <w:rPr>
+                <w:rFonts w:ascii="Times New Roman" w:hAnsi="Times New Roman"/>
+                <w:b w:val="0"/>
+                <w:color w:val="000000"/>
+                <w:sz w:val="18"/>
+              </w:rPr>
+              <w:t>100</w:t>
             </w:r>
           </w:p>
         </w:tc>
@@ -2486,78 +2929,68 @@
       <w:tr>
         <w:trPr>
           <w:cantSplit/>
-          <w:cantSplit/>
         </w:trPr>
         <w:tc>
           <w:tcPr>
-            <w:tcW w:type="dxa" w:w="2244"/>
-            <w:tcBorders>
-              <w:top w:val="single" w:sz="6" w:color="000000"/>
-              <w:left w:val="single" w:sz="6" w:color="000000"/>
-              <w:bottom w:val="single" w:sz="6" w:color="000000"/>
-              <w:right w:val="single" w:sz="6" w:color="000000"/>
-            </w:tcBorders>
+            <w:tcW w:type="dxa" w:w="3175"/>
+            <w:vAlign w:val="center"/>
             <w:shd w:fill="DEEAF6"/>
           </w:tcPr>
           <w:p>
             <w:pPr>
-              <w:spacing w:after="60" w:before="60"/>
-            </w:pPr>
-            <w:r>
-              <w:rPr>
-                <w:rFonts w:ascii="Times New Roman" w:hAnsi="Times New Roman"/>
-                <w:color w:val="000000"/>
-                <w:sz w:val="16"/>
-              </w:rPr>
-              <w:t>Humaitá II</w:t>
-            </w:r>
-          </w:p>
-        </w:tc>
-        <w:tc>
-          <w:tcPr>
-            <w:tcW w:type="dxa" w:w="2244"/>
-            <w:tcBorders>
-              <w:top w:val="single" w:sz="6" w:color="000000"/>
-              <w:left w:val="single" w:sz="6" w:color="000000"/>
-              <w:bottom w:val="single" w:sz="6" w:color="000000"/>
-              <w:right w:val="single" w:sz="6" w:color="000000"/>
-            </w:tcBorders>
+              <w:spacing w:before="60" w:after="60"/>
+              <w:jc w:val="left"/>
+            </w:pPr>
+            <w:r>
+              <w:rPr>
+                <w:rFonts w:ascii="Times New Roman" w:hAnsi="Times New Roman"/>
+                <w:b w:val="0"/>
+                <w:color w:val="000000"/>
+                <w:sz w:val="18"/>
+              </w:rPr>
+              <w:t>Humaitá I</w:t>
+            </w:r>
+          </w:p>
+        </w:tc>
+        <w:tc>
+          <w:tcPr>
+            <w:tcW w:type="dxa" w:w="907"/>
+            <w:vAlign w:val="center"/>
             <w:shd w:fill="DEEAF6"/>
           </w:tcPr>
           <w:p>
             <w:pPr>
-              <w:spacing w:after="60" w:before="60"/>
-            </w:pPr>
-            <w:r>
-              <w:rPr>
-                <w:rFonts w:ascii="Times New Roman" w:hAnsi="Times New Roman"/>
-                <w:color w:val="000000"/>
-                <w:sz w:val="16"/>
-              </w:rPr>
-              <w:t>155629</w:t>
-            </w:r>
-          </w:p>
-        </w:tc>
-        <w:tc>
-          <w:tcPr>
-            <w:tcW w:type="dxa" w:w="2245"/>
-            <w:tcBorders>
-              <w:top w:val="single" w:sz="6" w:color="000000"/>
-              <w:left w:val="single" w:sz="6" w:color="000000"/>
-              <w:bottom w:val="single" w:sz="6" w:color="000000"/>
-              <w:right w:val="single" w:sz="6" w:color="000000"/>
-            </w:tcBorders>
+              <w:spacing w:before="60" w:after="60"/>
+              <w:jc w:val="center"/>
+            </w:pPr>
+            <w:r>
+              <w:rPr>
+                <w:rFonts w:ascii="Times New Roman" w:hAnsi="Times New Roman"/>
+                <w:b w:val="0"/>
+                <w:color w:val="000000"/>
+                <w:sz w:val="18"/>
+              </w:rPr>
+              <w:t>155624</w:t>
+            </w:r>
+          </w:p>
+        </w:tc>
+        <w:tc>
+          <w:tcPr>
+            <w:tcW w:type="dxa" w:w="850"/>
+            <w:vAlign w:val="center"/>
             <w:shd w:fill="DEEAF6"/>
           </w:tcPr>
           <w:p>
             <w:pPr>
-              <w:spacing w:after="60" w:before="60"/>
-            </w:pPr>
-            <w:r>
-              <w:rPr>
-                <w:rFonts w:ascii="Times New Roman" w:hAnsi="Times New Roman"/>
-                <w:color w:val="000000"/>
-                <w:sz w:val="16"/>
+              <w:spacing w:before="60" w:after="60"/>
+              <w:jc w:val="center"/>
+            </w:pPr>
+            <w:r>
+              <w:rPr>
+                <w:rFonts w:ascii="Times New Roman" w:hAnsi="Times New Roman"/>
+                <w:b w:val="0"/>
+                <w:color w:val="000000"/>
+                <w:sz w:val="18"/>
               </w:rPr>
               <w:t>Diária</w:t>
             </w:r>
@@ -2565,25 +2998,89 @@
         </w:tc>
         <w:tc>
           <w:tcPr>
-            <w:tcW w:type="dxa" w:w="2245"/>
-            <w:tcBorders>
-              <w:top w:val="single" w:sz="6" w:color="000000"/>
-              <w:left w:val="single" w:sz="6" w:color="000000"/>
-              <w:bottom w:val="single" w:sz="6" w:color="000000"/>
-              <w:right w:val="single" w:sz="6" w:color="000000"/>
-            </w:tcBorders>
+            <w:tcW w:type="dxa" w:w="1006"/>
+            <w:vAlign w:val="center"/>
             <w:shd w:fill="DEEAF6"/>
           </w:tcPr>
           <w:p>
             <w:pPr>
+              <w:spacing w:before="60" w:after="60"/>
               <w:jc w:val="center"/>
             </w:pPr>
             <w:r>
               <w:rPr>
-                <w:rFonts w:ascii="Consolas" w:hAnsi="Consolas"/>
-                <w:sz w:val="16"/>
-              </w:rPr>
-              <w:t>40 | 40 | 40 | 25</w:t>
+                <w:rFonts w:ascii="Times New Roman" w:hAnsi="Times New Roman"/>
+                <w:b w:val="0"/>
+                <w:color w:val="000000"/>
+                <w:sz w:val="18"/>
+              </w:rPr>
+              <w:t>20</w:t>
+            </w:r>
+          </w:p>
+        </w:tc>
+        <w:tc>
+          <w:tcPr>
+            <w:tcW w:type="dxa" w:w="1006"/>
+            <w:vAlign w:val="center"/>
+            <w:shd w:fill="DEEAF6"/>
+          </w:tcPr>
+          <w:p>
+            <w:pPr>
+              <w:spacing w:before="60" w:after="60"/>
+              <w:jc w:val="center"/>
+            </w:pPr>
+            <w:r>
+              <w:rPr>
+                <w:rFonts w:ascii="Times New Roman" w:hAnsi="Times New Roman"/>
+                <w:b w:val="0"/>
+                <w:color w:val="000000"/>
+                <w:sz w:val="18"/>
+              </w:rPr>
+              <w:t>20</w:t>
+            </w:r>
+          </w:p>
+        </w:tc>
+        <w:tc>
+          <w:tcPr>
+            <w:tcW w:type="dxa" w:w="1006"/>
+            <w:vAlign w:val="center"/>
+            <w:shd w:fill="DEEAF6"/>
+          </w:tcPr>
+          <w:p>
+            <w:pPr>
+              <w:spacing w:before="60" w:after="60"/>
+              <w:jc w:val="center"/>
+            </w:pPr>
+            <w:r>
+              <w:rPr>
+                <w:rFonts w:ascii="Times New Roman" w:hAnsi="Times New Roman"/>
+                <w:b w:val="0"/>
+                <w:color w:val="000000"/>
+                <w:sz w:val="18"/>
+              </w:rPr>
+              <w:t>20</w:t>
+            </w:r>
+          </w:p>
+        </w:tc>
+        <w:tc>
+          <w:tcPr>
+            <w:tcW w:type="dxa" w:w="1006"/>
+            <w:vAlign w:val="center"/>
+            <w:shd w:fill="DEEAF6"/>
+          </w:tcPr>
+          <w:p>
+            <w:pPr>
+              <w:spacing w:before="60" w:after="60"/>
+              <w:jc w:val="center"/>
+            </w:pPr>
+            <w:r>
+              <w:rPr>
+                <w:rFonts w:ascii="Times New Roman" w:hAnsi="Times New Roman"/>
+                <w:b w:val="0"/>
+                <w:color w:val="000000"/>
+                <w:sz w:val="18"/>
+              </w:rPr>
+              <w:t>25</w:t>
             </w:r>
           </w:p>
         </w:tc>
@@ -2591,78 +3088,68 @@
       <w:tr>
         <w:trPr>
           <w:cantSplit/>
-          <w:cantSplit/>
         </w:trPr>
         <w:tc>
           <w:tcPr>
-            <w:tcW w:type="dxa" w:w="2244"/>
-            <w:tcBorders>
-              <w:top w:val="single" w:sz="6" w:color="000000"/>
-              <w:left w:val="single" w:sz="6" w:color="000000"/>
-              <w:bottom w:val="single" w:sz="6" w:color="000000"/>
-              <w:right w:val="single" w:sz="6" w:color="000000"/>
-            </w:tcBorders>
+            <w:tcW w:type="dxa" w:w="3175"/>
+            <w:vAlign w:val="center"/>
             <w:shd w:fill="DEEAF6"/>
           </w:tcPr>
           <w:p>
             <w:pPr>
-              <w:spacing w:after="60" w:before="60"/>
-            </w:pPr>
-            <w:r>
-              <w:rPr>
-                <w:rFonts w:ascii="Times New Roman" w:hAnsi="Times New Roman"/>
-                <w:color w:val="000000"/>
-                <w:sz w:val="16"/>
-              </w:rPr>
-              <w:t>Niterói</w:t>
-            </w:r>
-          </w:p>
-        </w:tc>
-        <w:tc>
-          <w:tcPr>
-            <w:tcW w:type="dxa" w:w="2244"/>
-            <w:tcBorders>
-              <w:top w:val="single" w:sz="6" w:color="000000"/>
-              <w:left w:val="single" w:sz="6" w:color="000000"/>
-              <w:bottom w:val="single" w:sz="6" w:color="000000"/>
-              <w:right w:val="single" w:sz="6" w:color="000000"/>
-            </w:tcBorders>
+              <w:spacing w:before="60" w:after="60"/>
+              <w:jc w:val="left"/>
+            </w:pPr>
+            <w:r>
+              <w:rPr>
+                <w:rFonts w:ascii="Times New Roman" w:hAnsi="Times New Roman"/>
+                <w:b w:val="0"/>
+                <w:color w:val="000000"/>
+                <w:sz w:val="18"/>
+              </w:rPr>
+              <w:t>Humaitá II</w:t>
+            </w:r>
+          </w:p>
+        </w:tc>
+        <w:tc>
+          <w:tcPr>
+            <w:tcW w:type="dxa" w:w="907"/>
+            <w:vAlign w:val="center"/>
             <w:shd w:fill="DEEAF6"/>
           </w:tcPr>
           <w:p>
             <w:pPr>
-              <w:spacing w:after="60" w:before="60"/>
-            </w:pPr>
-            <w:r>
-              <w:rPr>
-                <w:rFonts w:ascii="Times New Roman" w:hAnsi="Times New Roman"/>
-                <w:color w:val="000000"/>
-                <w:sz w:val="16"/>
-              </w:rPr>
-              <w:t>155625</w:t>
-            </w:r>
-          </w:p>
-        </w:tc>
-        <w:tc>
-          <w:tcPr>
-            <w:tcW w:type="dxa" w:w="2245"/>
-            <w:tcBorders>
-              <w:top w:val="single" w:sz="6" w:color="000000"/>
-              <w:left w:val="single" w:sz="6" w:color="000000"/>
-              <w:bottom w:val="single" w:sz="6" w:color="000000"/>
-              <w:right w:val="single" w:sz="6" w:color="000000"/>
-            </w:tcBorders>
+              <w:spacing w:before="60" w:after="60"/>
+              <w:jc w:val="center"/>
+            </w:pPr>
+            <w:r>
+              <w:rPr>
+                <w:rFonts w:ascii="Times New Roman" w:hAnsi="Times New Roman"/>
+                <w:b w:val="0"/>
+                <w:color w:val="000000"/>
+                <w:sz w:val="18"/>
+              </w:rPr>
+              <w:t>155629</w:t>
+            </w:r>
+          </w:p>
+        </w:tc>
+        <w:tc>
+          <w:tcPr>
+            <w:tcW w:type="dxa" w:w="850"/>
+            <w:vAlign w:val="center"/>
             <w:shd w:fill="DEEAF6"/>
           </w:tcPr>
           <w:p>
             <w:pPr>
-              <w:spacing w:after="60" w:before="60"/>
-            </w:pPr>
-            <w:r>
-              <w:rPr>
-                <w:rFonts w:ascii="Times New Roman" w:hAnsi="Times New Roman"/>
-                <w:color w:val="000000"/>
-                <w:sz w:val="16"/>
+              <w:spacing w:before="60" w:after="60"/>
+              <w:jc w:val="center"/>
+            </w:pPr>
+            <w:r>
+              <w:rPr>
+                <w:rFonts w:ascii="Times New Roman" w:hAnsi="Times New Roman"/>
+                <w:b w:val="0"/>
+                <w:color w:val="000000"/>
+                <w:sz w:val="18"/>
               </w:rPr>
               <w:t>Diária</w:t>
             </w:r>
@@ -2670,25 +3157,89 @@
         </w:tc>
         <w:tc>
           <w:tcPr>
-            <w:tcW w:type="dxa" w:w="2245"/>
-            <w:tcBorders>
-              <w:top w:val="single" w:sz="6" w:color="000000"/>
-              <w:left w:val="single" w:sz="6" w:color="000000"/>
-              <w:bottom w:val="single" w:sz="6" w:color="000000"/>
-              <w:right w:val="single" w:sz="6" w:color="000000"/>
-            </w:tcBorders>
+            <w:tcW w:type="dxa" w:w="1006"/>
+            <w:vAlign w:val="center"/>
             <w:shd w:fill="DEEAF6"/>
           </w:tcPr>
           <w:p>
             <w:pPr>
+              <w:spacing w:before="60" w:after="60"/>
               <w:jc w:val="center"/>
             </w:pPr>
             <w:r>
               <w:rPr>
-                <w:rFonts w:ascii="Consolas" w:hAnsi="Consolas"/>
-                <w:sz w:val="16"/>
-              </w:rPr>
-              <w:t>10 | 15 | 10 | 5</w:t>
+                <w:rFonts w:ascii="Times New Roman" w:hAnsi="Times New Roman"/>
+                <w:b w:val="0"/>
+                <w:color w:val="000000"/>
+                <w:sz w:val="18"/>
+              </w:rPr>
+              <w:t>40</w:t>
+            </w:r>
+          </w:p>
+        </w:tc>
+        <w:tc>
+          <w:tcPr>
+            <w:tcW w:type="dxa" w:w="1006"/>
+            <w:vAlign w:val="center"/>
+            <w:shd w:fill="DEEAF6"/>
+          </w:tcPr>
+          <w:p>
+            <w:pPr>
+              <w:spacing w:before="60" w:after="60"/>
+              <w:jc w:val="center"/>
+            </w:pPr>
+            <w:r>
+              <w:rPr>
+                <w:rFonts w:ascii="Times New Roman" w:hAnsi="Times New Roman"/>
+                <w:b w:val="0"/>
+                <w:color w:val="000000"/>
+                <w:sz w:val="18"/>
+              </w:rPr>
+              <w:t>40</w:t>
+            </w:r>
+          </w:p>
+        </w:tc>
+        <w:tc>
+          <w:tcPr>
+            <w:tcW w:type="dxa" w:w="1006"/>
+            <w:vAlign w:val="center"/>
+            <w:shd w:fill="DEEAF6"/>
+          </w:tcPr>
+          <w:p>
+            <w:pPr>
+              <w:spacing w:before="60" w:after="60"/>
+              <w:jc w:val="center"/>
+            </w:pPr>
+            <w:r>
+              <w:rPr>
+                <w:rFonts w:ascii="Times New Roman" w:hAnsi="Times New Roman"/>
+                <w:b w:val="0"/>
+                <w:color w:val="000000"/>
+                <w:sz w:val="18"/>
+              </w:rPr>
+              <w:t>40</w:t>
+            </w:r>
+          </w:p>
+        </w:tc>
+        <w:tc>
+          <w:tcPr>
+            <w:tcW w:type="dxa" w:w="1006"/>
+            <w:vAlign w:val="center"/>
+            <w:shd w:fill="DEEAF6"/>
+          </w:tcPr>
+          <w:p>
+            <w:pPr>
+              <w:spacing w:before="60" w:after="60"/>
+              <w:jc w:val="center"/>
+            </w:pPr>
+            <w:r>
+              <w:rPr>
+                <w:rFonts w:ascii="Times New Roman" w:hAnsi="Times New Roman"/>
+                <w:b w:val="0"/>
+                <w:color w:val="000000"/>
+                <w:sz w:val="18"/>
+              </w:rPr>
+              <w:t>25</w:t>
             </w:r>
           </w:p>
         </w:tc>
@@ -2696,78 +3247,68 @@
       <w:tr>
         <w:trPr>
           <w:cantSplit/>
-          <w:cantSplit/>
         </w:trPr>
         <w:tc>
           <w:tcPr>
-            <w:tcW w:type="dxa" w:w="2244"/>
-            <w:tcBorders>
-              <w:top w:val="single" w:sz="6" w:color="000000"/>
-              <w:left w:val="single" w:sz="6" w:color="000000"/>
-              <w:bottom w:val="single" w:sz="6" w:color="000000"/>
-              <w:right w:val="single" w:sz="6" w:color="000000"/>
-            </w:tcBorders>
+            <w:tcW w:type="dxa" w:w="3175"/>
+            <w:vAlign w:val="center"/>
             <w:shd w:fill="DEEAF6"/>
           </w:tcPr>
           <w:p>
             <w:pPr>
-              <w:spacing w:after="60" w:before="60"/>
-            </w:pPr>
-            <w:r>
-              <w:rPr>
-                <w:rFonts w:ascii="Times New Roman" w:hAnsi="Times New Roman"/>
-                <w:color w:val="000000"/>
-                <w:sz w:val="16"/>
-              </w:rPr>
-              <w:t>Tijuca I</w:t>
-            </w:r>
-          </w:p>
-        </w:tc>
-        <w:tc>
-          <w:tcPr>
-            <w:tcW w:type="dxa" w:w="2244"/>
-            <w:tcBorders>
-              <w:top w:val="single" w:sz="6" w:color="000000"/>
-              <w:left w:val="single" w:sz="6" w:color="000000"/>
-              <w:bottom w:val="single" w:sz="6" w:color="000000"/>
-              <w:right w:val="single" w:sz="6" w:color="000000"/>
-            </w:tcBorders>
+              <w:spacing w:before="60" w:after="60"/>
+              <w:jc w:val="left"/>
+            </w:pPr>
+            <w:r>
+              <w:rPr>
+                <w:rFonts w:ascii="Times New Roman" w:hAnsi="Times New Roman"/>
+                <w:b w:val="0"/>
+                <w:color w:val="000000"/>
+                <w:sz w:val="18"/>
+              </w:rPr>
+              <w:t>Niterói</w:t>
+            </w:r>
+          </w:p>
+        </w:tc>
+        <w:tc>
+          <w:tcPr>
+            <w:tcW w:type="dxa" w:w="907"/>
+            <w:vAlign w:val="center"/>
             <w:shd w:fill="DEEAF6"/>
           </w:tcPr>
           <w:p>
             <w:pPr>
-              <w:spacing w:after="60" w:before="60"/>
-            </w:pPr>
-            <w:r>
-              <w:rPr>
-                <w:rFonts w:ascii="Times New Roman" w:hAnsi="Times New Roman"/>
-                <w:color w:val="000000"/>
-                <w:sz w:val="16"/>
-              </w:rPr>
-              <w:t>155633</w:t>
-            </w:r>
-          </w:p>
-        </w:tc>
-        <w:tc>
-          <w:tcPr>
-            <w:tcW w:type="dxa" w:w="2245"/>
-            <w:tcBorders>
-              <w:top w:val="single" w:sz="6" w:color="000000"/>
-              <w:left w:val="single" w:sz="6" w:color="000000"/>
-              <w:bottom w:val="single" w:sz="6" w:color="000000"/>
-              <w:right w:val="single" w:sz="6" w:color="000000"/>
-            </w:tcBorders>
+              <w:spacing w:before="60" w:after="60"/>
+              <w:jc w:val="center"/>
+            </w:pPr>
+            <w:r>
+              <w:rPr>
+                <w:rFonts w:ascii="Times New Roman" w:hAnsi="Times New Roman"/>
+                <w:b w:val="0"/>
+                <w:color w:val="000000"/>
+                <w:sz w:val="18"/>
+              </w:rPr>
+              <w:t>155625</w:t>
+            </w:r>
+          </w:p>
+        </w:tc>
+        <w:tc>
+          <w:tcPr>
+            <w:tcW w:type="dxa" w:w="850"/>
+            <w:vAlign w:val="center"/>
             <w:shd w:fill="DEEAF6"/>
           </w:tcPr>
           <w:p>
             <w:pPr>
-              <w:spacing w:after="60" w:before="60"/>
-            </w:pPr>
-            <w:r>
-              <w:rPr>
-                <w:rFonts w:ascii="Times New Roman" w:hAnsi="Times New Roman"/>
-                <w:color w:val="000000"/>
-                <w:sz w:val="16"/>
+              <w:spacing w:before="60" w:after="60"/>
+              <w:jc w:val="center"/>
+            </w:pPr>
+            <w:r>
+              <w:rPr>
+                <w:rFonts w:ascii="Times New Roman" w:hAnsi="Times New Roman"/>
+                <w:b w:val="0"/>
+                <w:color w:val="000000"/>
+                <w:sz w:val="18"/>
               </w:rPr>
               <w:t>Diária</w:t>
             </w:r>
@@ -2775,25 +3316,89 @@
         </w:tc>
         <w:tc>
           <w:tcPr>
-            <w:tcW w:type="dxa" w:w="2245"/>
-            <w:tcBorders>
-              <w:top w:val="single" w:sz="6" w:color="000000"/>
-              <w:left w:val="single" w:sz="6" w:color="000000"/>
-              <w:bottom w:val="single" w:sz="6" w:color="000000"/>
-              <w:right w:val="single" w:sz="6" w:color="000000"/>
-            </w:tcBorders>
+            <w:tcW w:type="dxa" w:w="1006"/>
+            <w:vAlign w:val="center"/>
             <w:shd w:fill="DEEAF6"/>
           </w:tcPr>
           <w:p>
             <w:pPr>
+              <w:spacing w:before="60" w:after="60"/>
               <w:jc w:val="center"/>
             </w:pPr>
             <w:r>
               <w:rPr>
-                <w:rFonts w:ascii="Consolas" w:hAnsi="Consolas"/>
-                <w:sz w:val="16"/>
-              </w:rPr>
-              <w:t>10 | 15 | 15 | 5</w:t>
+                <w:rFonts w:ascii="Times New Roman" w:hAnsi="Times New Roman"/>
+                <w:b w:val="0"/>
+                <w:color w:val="000000"/>
+                <w:sz w:val="18"/>
+              </w:rPr>
+              <w:t>10</w:t>
+            </w:r>
+          </w:p>
+        </w:tc>
+        <w:tc>
+          <w:tcPr>
+            <w:tcW w:type="dxa" w:w="1006"/>
+            <w:vAlign w:val="center"/>
+            <w:shd w:fill="DEEAF6"/>
+          </w:tcPr>
+          <w:p>
+            <w:pPr>
+              <w:spacing w:before="60" w:after="60"/>
+              <w:jc w:val="center"/>
+            </w:pPr>
+            <w:r>
+              <w:rPr>
+                <w:rFonts w:ascii="Times New Roman" w:hAnsi="Times New Roman"/>
+                <w:b w:val="0"/>
+                <w:color w:val="000000"/>
+                <w:sz w:val="18"/>
+              </w:rPr>
+              <w:t>15</w:t>
+            </w:r>
+          </w:p>
+        </w:tc>
+        <w:tc>
+          <w:tcPr>
+            <w:tcW w:type="dxa" w:w="1006"/>
+            <w:vAlign w:val="center"/>
+            <w:shd w:fill="DEEAF6"/>
+          </w:tcPr>
+          <w:p>
+            <w:pPr>
+              <w:spacing w:before="60" w:after="60"/>
+              <w:jc w:val="center"/>
+            </w:pPr>
+            <w:r>
+              <w:rPr>
+                <w:rFonts w:ascii="Times New Roman" w:hAnsi="Times New Roman"/>
+                <w:b w:val="0"/>
+                <w:color w:val="000000"/>
+                <w:sz w:val="18"/>
+              </w:rPr>
+              <w:t>10</w:t>
+            </w:r>
+          </w:p>
+        </w:tc>
+        <w:tc>
+          <w:tcPr>
+            <w:tcW w:type="dxa" w:w="1006"/>
+            <w:vAlign w:val="center"/>
+            <w:shd w:fill="DEEAF6"/>
+          </w:tcPr>
+          <w:p>
+            <w:pPr>
+              <w:spacing w:before="60" w:after="60"/>
+              <w:jc w:val="center"/>
+            </w:pPr>
+            <w:r>
+              <w:rPr>
+                <w:rFonts w:ascii="Times New Roman" w:hAnsi="Times New Roman"/>
+                <w:b w:val="0"/>
+                <w:color w:val="000000"/>
+                <w:sz w:val="18"/>
+              </w:rPr>
+              <w:t>5</w:t>
             </w:r>
           </w:p>
         </w:tc>
@@ -2801,78 +3406,68 @@
       <w:tr>
         <w:trPr>
           <w:cantSplit/>
-          <w:cantSplit/>
         </w:trPr>
         <w:tc>
           <w:tcPr>
-            <w:tcW w:type="dxa" w:w="2244"/>
-            <w:tcBorders>
-              <w:top w:val="single" w:sz="6" w:color="000000"/>
-              <w:left w:val="single" w:sz="6" w:color="000000"/>
-              <w:bottom w:val="single" w:sz="6" w:color="000000"/>
-              <w:right w:val="single" w:sz="6" w:color="000000"/>
-            </w:tcBorders>
+            <w:tcW w:type="dxa" w:w="3175"/>
+            <w:vAlign w:val="center"/>
             <w:shd w:fill="DEEAF6"/>
           </w:tcPr>
           <w:p>
             <w:pPr>
-              <w:spacing w:after="60" w:before="60"/>
-            </w:pPr>
-            <w:r>
-              <w:rPr>
-                <w:rFonts w:ascii="Times New Roman" w:hAnsi="Times New Roman"/>
-                <w:color w:val="000000"/>
-                <w:sz w:val="16"/>
-              </w:rPr>
-              <w:t>Tijuca II</w:t>
-            </w:r>
-          </w:p>
-        </w:tc>
-        <w:tc>
-          <w:tcPr>
-            <w:tcW w:type="dxa" w:w="2244"/>
-            <w:tcBorders>
-              <w:top w:val="single" w:sz="6" w:color="000000"/>
-              <w:left w:val="single" w:sz="6" w:color="000000"/>
-              <w:bottom w:val="single" w:sz="6" w:color="000000"/>
-              <w:right w:val="single" w:sz="6" w:color="000000"/>
-            </w:tcBorders>
+              <w:spacing w:before="60" w:after="60"/>
+              <w:jc w:val="left"/>
+            </w:pPr>
+            <w:r>
+              <w:rPr>
+                <w:rFonts w:ascii="Times New Roman" w:hAnsi="Times New Roman"/>
+                <w:b w:val="0"/>
+                <w:color w:val="000000"/>
+                <w:sz w:val="18"/>
+              </w:rPr>
+              <w:t>Tijuca I</w:t>
+            </w:r>
+          </w:p>
+        </w:tc>
+        <w:tc>
+          <w:tcPr>
+            <w:tcW w:type="dxa" w:w="907"/>
+            <w:vAlign w:val="center"/>
             <w:shd w:fill="DEEAF6"/>
           </w:tcPr>
           <w:p>
             <w:pPr>
-              <w:spacing w:after="60" w:before="60"/>
-            </w:pPr>
-            <w:r>
-              <w:rPr>
-                <w:rFonts w:ascii="Times New Roman" w:hAnsi="Times New Roman"/>
-                <w:color w:val="000000"/>
-                <w:sz w:val="16"/>
-              </w:rPr>
-              <w:t>155634</w:t>
-            </w:r>
-          </w:p>
-        </w:tc>
-        <w:tc>
-          <w:tcPr>
-            <w:tcW w:type="dxa" w:w="2245"/>
-            <w:tcBorders>
-              <w:top w:val="single" w:sz="6" w:color="000000"/>
-              <w:left w:val="single" w:sz="6" w:color="000000"/>
-              <w:bottom w:val="single" w:sz="6" w:color="000000"/>
-              <w:right w:val="single" w:sz="6" w:color="000000"/>
-            </w:tcBorders>
+              <w:spacing w:before="60" w:after="60"/>
+              <w:jc w:val="center"/>
+            </w:pPr>
+            <w:r>
+              <w:rPr>
+                <w:rFonts w:ascii="Times New Roman" w:hAnsi="Times New Roman"/>
+                <w:b w:val="0"/>
+                <w:color w:val="000000"/>
+                <w:sz w:val="18"/>
+              </w:rPr>
+              <w:t>155633</w:t>
+            </w:r>
+          </w:p>
+        </w:tc>
+        <w:tc>
+          <w:tcPr>
+            <w:tcW w:type="dxa" w:w="850"/>
+            <w:vAlign w:val="center"/>
             <w:shd w:fill="DEEAF6"/>
           </w:tcPr>
           <w:p>
             <w:pPr>
-              <w:spacing w:after="60" w:before="60"/>
-            </w:pPr>
-            <w:r>
-              <w:rPr>
-                <w:rFonts w:ascii="Times New Roman" w:hAnsi="Times New Roman"/>
-                <w:color w:val="000000"/>
-                <w:sz w:val="16"/>
+              <w:spacing w:before="60" w:after="60"/>
+              <w:jc w:val="center"/>
+            </w:pPr>
+            <w:r>
+              <w:rPr>
+                <w:rFonts w:ascii="Times New Roman" w:hAnsi="Times New Roman"/>
+                <w:b w:val="0"/>
+                <w:color w:val="000000"/>
+                <w:sz w:val="18"/>
               </w:rPr>
               <w:t>Diária</w:t>
             </w:r>
@@ -2880,25 +3475,89 @@
         </w:tc>
         <w:tc>
           <w:tcPr>
-            <w:tcW w:type="dxa" w:w="2245"/>
-            <w:tcBorders>
-              <w:top w:val="single" w:sz="6" w:color="000000"/>
-              <w:left w:val="single" w:sz="6" w:color="000000"/>
-              <w:bottom w:val="single" w:sz="6" w:color="000000"/>
-              <w:right w:val="single" w:sz="6" w:color="000000"/>
-            </w:tcBorders>
+            <w:tcW w:type="dxa" w:w="1006"/>
+            <w:vAlign w:val="center"/>
             <w:shd w:fill="DEEAF6"/>
           </w:tcPr>
           <w:p>
             <w:pPr>
+              <w:spacing w:before="60" w:after="60"/>
               <w:jc w:val="center"/>
             </w:pPr>
             <w:r>
               <w:rPr>
-                <w:rFonts w:ascii="Consolas" w:hAnsi="Consolas"/>
-                <w:sz w:val="16"/>
-              </w:rPr>
-              <w:t>60 | 180 | 120 | 60</w:t>
+                <w:rFonts w:ascii="Times New Roman" w:hAnsi="Times New Roman"/>
+                <w:b w:val="0"/>
+                <w:color w:val="000000"/>
+                <w:sz w:val="18"/>
+              </w:rPr>
+              <w:t>10</w:t>
+            </w:r>
+          </w:p>
+        </w:tc>
+        <w:tc>
+          <w:tcPr>
+            <w:tcW w:type="dxa" w:w="1006"/>
+            <w:vAlign w:val="center"/>
+            <w:shd w:fill="DEEAF6"/>
+          </w:tcPr>
+          <w:p>
+            <w:pPr>
+              <w:spacing w:before="60" w:after="60"/>
+              <w:jc w:val="center"/>
+            </w:pPr>
+            <w:r>
+              <w:rPr>
+                <w:rFonts w:ascii="Times New Roman" w:hAnsi="Times New Roman"/>
+                <w:b w:val="0"/>
+                <w:color w:val="000000"/>
+                <w:sz w:val="18"/>
+              </w:rPr>
+              <w:t>15</w:t>
+            </w:r>
+          </w:p>
+        </w:tc>
+        <w:tc>
+          <w:tcPr>
+            <w:tcW w:type="dxa" w:w="1006"/>
+            <w:vAlign w:val="center"/>
+            <w:shd w:fill="DEEAF6"/>
+          </w:tcPr>
+          <w:p>
+            <w:pPr>
+              <w:spacing w:before="60" w:after="60"/>
+              <w:jc w:val="center"/>
+            </w:pPr>
+            <w:r>
+              <w:rPr>
+                <w:rFonts w:ascii="Times New Roman" w:hAnsi="Times New Roman"/>
+                <w:b w:val="0"/>
+                <w:color w:val="000000"/>
+                <w:sz w:val="18"/>
+              </w:rPr>
+              <w:t>15</w:t>
+            </w:r>
+          </w:p>
+        </w:tc>
+        <w:tc>
+          <w:tcPr>
+            <w:tcW w:type="dxa" w:w="1006"/>
+            <w:vAlign w:val="center"/>
+            <w:shd w:fill="DEEAF6"/>
+          </w:tcPr>
+          <w:p>
+            <w:pPr>
+              <w:spacing w:before="60" w:after="60"/>
+              <w:jc w:val="center"/>
+            </w:pPr>
+            <w:r>
+              <w:rPr>
+                <w:rFonts w:ascii="Times New Roman" w:hAnsi="Times New Roman"/>
+                <w:b w:val="0"/>
+                <w:color w:val="000000"/>
+                <w:sz w:val="18"/>
+              </w:rPr>
+              <w:t>5</w:t>
             </w:r>
           </w:p>
         </w:tc>
@@ -2906,78 +3565,68 @@
       <w:tr>
         <w:trPr>
           <w:cantSplit/>
-          <w:cantSplit/>
         </w:trPr>
         <w:tc>
           <w:tcPr>
-            <w:tcW w:type="dxa" w:w="2244"/>
-            <w:tcBorders>
-              <w:top w:val="single" w:sz="6" w:color="000000"/>
-              <w:left w:val="single" w:sz="6" w:color="000000"/>
-              <w:bottom w:val="single" w:sz="6" w:color="000000"/>
-              <w:right w:val="single" w:sz="6" w:color="000000"/>
-            </w:tcBorders>
+            <w:tcW w:type="dxa" w:w="3175"/>
+            <w:vAlign w:val="center"/>
             <w:shd w:fill="DEEAF6"/>
           </w:tcPr>
           <w:p>
             <w:pPr>
-              <w:spacing w:after="60" w:before="60"/>
-            </w:pPr>
-            <w:r>
-              <w:rPr>
-                <w:rFonts w:ascii="Times New Roman" w:hAnsi="Times New Roman"/>
-                <w:color w:val="000000"/>
-                <w:sz w:val="16"/>
-              </w:rPr>
-              <w:t>Engenho Novo I</w:t>
-            </w:r>
-          </w:p>
-        </w:tc>
-        <w:tc>
-          <w:tcPr>
-            <w:tcW w:type="dxa" w:w="2244"/>
-            <w:tcBorders>
-              <w:top w:val="single" w:sz="6" w:color="000000"/>
-              <w:left w:val="single" w:sz="6" w:color="000000"/>
-              <w:bottom w:val="single" w:sz="6" w:color="000000"/>
-              <w:right w:val="single" w:sz="6" w:color="000000"/>
-            </w:tcBorders>
+              <w:spacing w:before="60" w:after="60"/>
+              <w:jc w:val="left"/>
+            </w:pPr>
+            <w:r>
+              <w:rPr>
+                <w:rFonts w:ascii="Times New Roman" w:hAnsi="Times New Roman"/>
+                <w:b w:val="0"/>
+                <w:color w:val="000000"/>
+                <w:sz w:val="18"/>
+              </w:rPr>
+              <w:t>Tijuca II</w:t>
+            </w:r>
+          </w:p>
+        </w:tc>
+        <w:tc>
+          <w:tcPr>
+            <w:tcW w:type="dxa" w:w="907"/>
+            <w:vAlign w:val="center"/>
             <w:shd w:fill="DEEAF6"/>
           </w:tcPr>
           <w:p>
             <w:pPr>
-              <w:spacing w:after="60" w:before="60"/>
-            </w:pPr>
-            <w:r>
-              <w:rPr>
-                <w:rFonts w:ascii="Times New Roman" w:hAnsi="Times New Roman"/>
-                <w:color w:val="000000"/>
-                <w:sz w:val="16"/>
-              </w:rPr>
-              <w:t>155635</w:t>
-            </w:r>
-          </w:p>
-        </w:tc>
-        <w:tc>
-          <w:tcPr>
-            <w:tcW w:type="dxa" w:w="2245"/>
-            <w:tcBorders>
-              <w:top w:val="single" w:sz="6" w:color="000000"/>
-              <w:left w:val="single" w:sz="6" w:color="000000"/>
-              <w:bottom w:val="single" w:sz="6" w:color="000000"/>
-              <w:right w:val="single" w:sz="6" w:color="000000"/>
-            </w:tcBorders>
+              <w:spacing w:before="60" w:after="60"/>
+              <w:jc w:val="center"/>
+            </w:pPr>
+            <w:r>
+              <w:rPr>
+                <w:rFonts w:ascii="Times New Roman" w:hAnsi="Times New Roman"/>
+                <w:b w:val="0"/>
+                <w:color w:val="000000"/>
+                <w:sz w:val="18"/>
+              </w:rPr>
+              <w:t>155634</w:t>
+            </w:r>
+          </w:p>
+        </w:tc>
+        <w:tc>
+          <w:tcPr>
+            <w:tcW w:type="dxa" w:w="850"/>
+            <w:vAlign w:val="center"/>
             <w:shd w:fill="DEEAF6"/>
           </w:tcPr>
           <w:p>
             <w:pPr>
-              <w:spacing w:after="60" w:before="60"/>
-            </w:pPr>
-            <w:r>
-              <w:rPr>
-                <w:rFonts w:ascii="Times New Roman" w:hAnsi="Times New Roman"/>
-                <w:color w:val="000000"/>
-                <w:sz w:val="16"/>
+              <w:spacing w:before="60" w:after="60"/>
+              <w:jc w:val="center"/>
+            </w:pPr>
+            <w:r>
+              <w:rPr>
+                <w:rFonts w:ascii="Times New Roman" w:hAnsi="Times New Roman"/>
+                <w:b w:val="0"/>
+                <w:color w:val="000000"/>
+                <w:sz w:val="18"/>
               </w:rPr>
               <w:t>Diária</w:t>
             </w:r>
@@ -2985,25 +3634,89 @@
         </w:tc>
         <w:tc>
           <w:tcPr>
-            <w:tcW w:type="dxa" w:w="2245"/>
-            <w:tcBorders>
-              <w:top w:val="single" w:sz="6" w:color="000000"/>
-              <w:left w:val="single" w:sz="6" w:color="000000"/>
-              <w:bottom w:val="single" w:sz="6" w:color="000000"/>
-              <w:right w:val="single" w:sz="6" w:color="000000"/>
-            </w:tcBorders>
+            <w:tcW w:type="dxa" w:w="1006"/>
+            <w:vAlign w:val="center"/>
             <w:shd w:fill="DEEAF6"/>
           </w:tcPr>
           <w:p>
             <w:pPr>
+              <w:spacing w:before="60" w:after="60"/>
               <w:jc w:val="center"/>
             </w:pPr>
             <w:r>
               <w:rPr>
-                <w:rFonts w:ascii="Consolas" w:hAnsi="Consolas"/>
-                <w:sz w:val="16"/>
-              </w:rPr>
-              <w:t>5 | 0 | 5 | 5</w:t>
+                <w:rFonts w:ascii="Times New Roman" w:hAnsi="Times New Roman"/>
+                <w:b w:val="0"/>
+                <w:color w:val="000000"/>
+                <w:sz w:val="18"/>
+              </w:rPr>
+              <w:t>60</w:t>
+            </w:r>
+          </w:p>
+        </w:tc>
+        <w:tc>
+          <w:tcPr>
+            <w:tcW w:type="dxa" w:w="1006"/>
+            <w:vAlign w:val="center"/>
+            <w:shd w:fill="DEEAF6"/>
+          </w:tcPr>
+          <w:p>
+            <w:pPr>
+              <w:spacing w:before="60" w:after="60"/>
+              <w:jc w:val="center"/>
+            </w:pPr>
+            <w:r>
+              <w:rPr>
+                <w:rFonts w:ascii="Times New Roman" w:hAnsi="Times New Roman"/>
+                <w:b w:val="0"/>
+                <w:color w:val="000000"/>
+                <w:sz w:val="18"/>
+              </w:rPr>
+              <w:t>180</w:t>
+            </w:r>
+          </w:p>
+        </w:tc>
+        <w:tc>
+          <w:tcPr>
+            <w:tcW w:type="dxa" w:w="1006"/>
+            <w:vAlign w:val="center"/>
+            <w:shd w:fill="DEEAF6"/>
+          </w:tcPr>
+          <w:p>
+            <w:pPr>
+              <w:spacing w:before="60" w:after="60"/>
+              <w:jc w:val="center"/>
+            </w:pPr>
+            <w:r>
+              <w:rPr>
+                <w:rFonts w:ascii="Times New Roman" w:hAnsi="Times New Roman"/>
+                <w:b w:val="0"/>
+                <w:color w:val="000000"/>
+                <w:sz w:val="18"/>
+              </w:rPr>
+              <w:t>120</w:t>
+            </w:r>
+          </w:p>
+        </w:tc>
+        <w:tc>
+          <w:tcPr>
+            <w:tcW w:type="dxa" w:w="1006"/>
+            <w:vAlign w:val="center"/>
+            <w:shd w:fill="DEEAF6"/>
+          </w:tcPr>
+          <w:p>
+            <w:pPr>
+              <w:spacing w:before="60" w:after="60"/>
+              <w:jc w:val="center"/>
+            </w:pPr>
+            <w:r>
+              <w:rPr>
+                <w:rFonts w:ascii="Times New Roman" w:hAnsi="Times New Roman"/>
+                <w:b w:val="0"/>
+                <w:color w:val="000000"/>
+                <w:sz w:val="18"/>
+              </w:rPr>
+              <w:t>60</w:t>
             </w:r>
           </w:p>
         </w:tc>
@@ -3011,28 +3724,183 @@
       <w:tr>
         <w:trPr>
           <w:cantSplit/>
+        </w:trPr>
+        <w:tc>
+          <w:tcPr>
+            <w:tcW w:type="dxa" w:w="3175"/>
+            <w:vAlign w:val="center"/>
+            <w:shd w:fill="DEEAF6"/>
+          </w:tcPr>
+          <w:p>
+            <w:pPr>
+              <w:spacing w:before="60" w:after="60"/>
+              <w:jc w:val="left"/>
+            </w:pPr>
+            <w:r>
+              <w:rPr>
+                <w:rFonts w:ascii="Times New Roman" w:hAnsi="Times New Roman"/>
+                <w:b w:val="0"/>
+                <w:color w:val="000000"/>
+                <w:sz w:val="18"/>
+              </w:rPr>
+              <w:t>Engenho Novo I</w:t>
+            </w:r>
+          </w:p>
+        </w:tc>
+        <w:tc>
+          <w:tcPr>
+            <w:tcW w:type="dxa" w:w="907"/>
+            <w:vAlign w:val="center"/>
+            <w:shd w:fill="DEEAF6"/>
+          </w:tcPr>
+          <w:p>
+            <w:pPr>
+              <w:spacing w:before="60" w:after="60"/>
+              <w:jc w:val="center"/>
+            </w:pPr>
+            <w:r>
+              <w:rPr>
+                <w:rFonts w:ascii="Times New Roman" w:hAnsi="Times New Roman"/>
+                <w:b w:val="0"/>
+                <w:color w:val="000000"/>
+                <w:sz w:val="18"/>
+              </w:rPr>
+              <w:t>155635</w:t>
+            </w:r>
+          </w:p>
+        </w:tc>
+        <w:tc>
+          <w:tcPr>
+            <w:tcW w:type="dxa" w:w="850"/>
+            <w:vAlign w:val="center"/>
+            <w:shd w:fill="DEEAF6"/>
+          </w:tcPr>
+          <w:p>
+            <w:pPr>
+              <w:spacing w:before="60" w:after="60"/>
+              <w:jc w:val="center"/>
+            </w:pPr>
+            <w:r>
+              <w:rPr>
+                <w:rFonts w:ascii="Times New Roman" w:hAnsi="Times New Roman"/>
+                <w:b w:val="0"/>
+                <w:color w:val="000000"/>
+                <w:sz w:val="18"/>
+              </w:rPr>
+              <w:t>Diária</w:t>
+            </w:r>
+          </w:p>
+        </w:tc>
+        <w:tc>
+          <w:tcPr>
+            <w:tcW w:type="dxa" w:w="1006"/>
+            <w:vAlign w:val="center"/>
+            <w:shd w:fill="DEEAF6"/>
+          </w:tcPr>
+          <w:p>
+            <w:pPr>
+              <w:spacing w:before="60" w:after="60"/>
+              <w:jc w:val="center"/>
+            </w:pPr>
+            <w:r>
+              <w:rPr>
+                <w:rFonts w:ascii="Times New Roman" w:hAnsi="Times New Roman"/>
+                <w:b w:val="0"/>
+                <w:color w:val="000000"/>
+                <w:sz w:val="18"/>
+              </w:rPr>
+              <w:t>5</w:t>
+            </w:r>
+          </w:p>
+        </w:tc>
+        <w:tc>
+          <w:tcPr>
+            <w:tcW w:type="dxa" w:w="1006"/>
+            <w:vAlign w:val="center"/>
+            <w:shd w:fill="DEEAF6"/>
+          </w:tcPr>
+          <w:p>
+            <w:pPr>
+              <w:spacing w:before="60" w:after="60"/>
+              <w:jc w:val="center"/>
+            </w:pPr>
+            <w:r>
+              <w:rPr>
+                <w:rFonts w:ascii="Times New Roman" w:hAnsi="Times New Roman"/>
+                <w:b w:val="0"/>
+                <w:color w:val="000000"/>
+                <w:sz w:val="18"/>
+              </w:rPr>
+              <w:t>0</w:t>
+            </w:r>
+          </w:p>
+        </w:tc>
+        <w:tc>
+          <w:tcPr>
+            <w:tcW w:type="dxa" w:w="1006"/>
+            <w:vAlign w:val="center"/>
+            <w:shd w:fill="DEEAF6"/>
+          </w:tcPr>
+          <w:p>
+            <w:pPr>
+              <w:spacing w:before="60" w:after="60"/>
+              <w:jc w:val="center"/>
+            </w:pPr>
+            <w:r>
+              <w:rPr>
+                <w:rFonts w:ascii="Times New Roman" w:hAnsi="Times New Roman"/>
+                <w:b w:val="0"/>
+                <w:color w:val="000000"/>
+                <w:sz w:val="18"/>
+              </w:rPr>
+              <w:t>5</w:t>
+            </w:r>
+          </w:p>
+        </w:tc>
+        <w:tc>
+          <w:tcPr>
+            <w:tcW w:type="dxa" w:w="1006"/>
+            <w:vAlign w:val="center"/>
+            <w:shd w:fill="DEEAF6"/>
+          </w:tcPr>
+          <w:p>
+            <w:pPr>
+              <w:spacing w:before="60" w:after="60"/>
+              <w:jc w:val="center"/>
+            </w:pPr>
+            <w:r>
+              <w:rPr>
+                <w:rFonts w:ascii="Times New Roman" w:hAnsi="Times New Roman"/>
+                <w:b w:val="0"/>
+                <w:color w:val="000000"/>
+                <w:sz w:val="18"/>
+              </w:rPr>
+              <w:t>5</w:t>
+            </w:r>
+          </w:p>
+        </w:tc>
+      </w:tr>
+      <w:tr>
+        <w:trPr>
           <w:cantSplit/>
         </w:trPr>
         <w:tc>
           <w:tcPr>
-            <w:tcW w:type="dxa" w:w="2244"/>
-            <w:tcBorders>
-              <w:top w:val="single" w:sz="6" w:color="000000"/>
-              <w:left w:val="single" w:sz="6" w:color="000000"/>
-              <w:bottom w:val="single" w:sz="6" w:color="000000"/>
-              <w:right w:val="single" w:sz="6" w:color="000000"/>
-            </w:tcBorders>
+            <w:tcW w:type="dxa" w:w="3175"/>
+            <w:vAlign w:val="center"/>
             <w:shd w:fill="DEEAF6"/>
           </w:tcPr>
           <w:p>
             <w:pPr>
-              <w:spacing w:after="60" w:before="60"/>
-            </w:pPr>
-            <w:r>
-              <w:rPr>
-                <w:rFonts w:ascii="Times New Roman" w:hAnsi="Times New Roman"/>
-                <w:color w:val="000000"/>
-                <w:sz w:val="16"/>
+              <w:spacing w:before="60" w:after="60"/>
+              <w:jc w:val="left"/>
+            </w:pPr>
+            <w:r>
+              <w:rPr>
+                <w:rFonts w:ascii="Times New Roman" w:hAnsi="Times New Roman"/>
+                <w:b w:val="0"/>
+                <w:color w:val="000000"/>
+                <w:sz w:val="18"/>
               </w:rPr>
               <w:t>Engenho Novo II</w:t>
             </w:r>
@@ -3040,24 +3908,21 @@
         </w:tc>
         <w:tc>
           <w:tcPr>
-            <w:tcW w:type="dxa" w:w="2244"/>
-            <w:tcBorders>
-              <w:top w:val="single" w:sz="6" w:color="000000"/>
-              <w:left w:val="single" w:sz="6" w:color="000000"/>
-              <w:bottom w:val="single" w:sz="6" w:color="000000"/>
-              <w:right w:val="single" w:sz="6" w:color="000000"/>
-            </w:tcBorders>
+            <w:tcW w:type="dxa" w:w="907"/>
+            <w:vAlign w:val="center"/>
             <w:shd w:fill="DEEAF6"/>
           </w:tcPr>
           <w:p>
             <w:pPr>
-              <w:spacing w:after="60" w:before="60"/>
-            </w:pPr>
-            <w:r>
-              <w:rPr>
-                <w:rFonts w:ascii="Times New Roman" w:hAnsi="Times New Roman"/>
-                <w:color w:val="000000"/>
-                <w:sz w:val="16"/>
+              <w:spacing w:before="60" w:after="60"/>
+              <w:jc w:val="center"/>
+            </w:pPr>
+            <w:r>
+              <w:rPr>
+                <w:rFonts w:ascii="Times New Roman" w:hAnsi="Times New Roman"/>
+                <w:b w:val="0"/>
+                <w:color w:val="000000"/>
+                <w:sz w:val="18"/>
               </w:rPr>
               <w:t>155636</w:t>
             </w:r>
@@ -3065,24 +3930,21 @@
         </w:tc>
         <w:tc>
           <w:tcPr>
-            <w:tcW w:type="dxa" w:w="2245"/>
-            <w:tcBorders>
-              <w:top w:val="single" w:sz="6" w:color="000000"/>
-              <w:left w:val="single" w:sz="6" w:color="000000"/>
-              <w:bottom w:val="single" w:sz="6" w:color="000000"/>
-              <w:right w:val="single" w:sz="6" w:color="000000"/>
-            </w:tcBorders>
+            <w:tcW w:type="dxa" w:w="850"/>
+            <w:vAlign w:val="center"/>
             <w:shd w:fill="DEEAF6"/>
           </w:tcPr>
           <w:p>
             <w:pPr>
-              <w:spacing w:after="60" w:before="60"/>
-            </w:pPr>
-            <w:r>
-              <w:rPr>
-                <w:rFonts w:ascii="Times New Roman" w:hAnsi="Times New Roman"/>
-                <w:color w:val="000000"/>
-                <w:sz w:val="16"/>
+              <w:spacing w:before="60" w:after="60"/>
+              <w:jc w:val="center"/>
+            </w:pPr>
+            <w:r>
+              <w:rPr>
+                <w:rFonts w:ascii="Times New Roman" w:hAnsi="Times New Roman"/>
+                <w:b w:val="0"/>
+                <w:color w:val="000000"/>
+                <w:sz w:val="18"/>
               </w:rPr>
               <w:t>Diária</w:t>
             </w:r>
@@ -3090,25 +3952,89 @@
         </w:tc>
         <w:tc>
           <w:tcPr>
-            <w:tcW w:type="dxa" w:w="2245"/>
-            <w:tcBorders>
-              <w:top w:val="single" w:sz="6" w:color="000000"/>
-              <w:left w:val="single" w:sz="6" w:color="000000"/>
-              <w:bottom w:val="single" w:sz="6" w:color="000000"/>
-              <w:right w:val="single" w:sz="6" w:color="000000"/>
-            </w:tcBorders>
+            <w:tcW w:type="dxa" w:w="1006"/>
+            <w:vAlign w:val="center"/>
             <w:shd w:fill="DEEAF6"/>
           </w:tcPr>
           <w:p>
             <w:pPr>
+              <w:spacing w:before="60" w:after="60"/>
               <w:jc w:val="center"/>
             </w:pPr>
             <w:r>
               <w:rPr>
-                <w:rFonts w:ascii="Consolas" w:hAnsi="Consolas"/>
-                <w:sz w:val="16"/>
-              </w:rPr>
-              <w:t>100 | 100 | 50 | 50</w:t>
+                <w:rFonts w:ascii="Times New Roman" w:hAnsi="Times New Roman"/>
+                <w:b w:val="0"/>
+                <w:color w:val="000000"/>
+                <w:sz w:val="18"/>
+              </w:rPr>
+              <w:t>100</w:t>
+            </w:r>
+          </w:p>
+        </w:tc>
+        <w:tc>
+          <w:tcPr>
+            <w:tcW w:type="dxa" w:w="1006"/>
+            <w:vAlign w:val="center"/>
+            <w:shd w:fill="DEEAF6"/>
+          </w:tcPr>
+          <w:p>
+            <w:pPr>
+              <w:spacing w:before="60" w:after="60"/>
+              <w:jc w:val="center"/>
+            </w:pPr>
+            <w:r>
+              <w:rPr>
+                <w:rFonts w:ascii="Times New Roman" w:hAnsi="Times New Roman"/>
+                <w:b w:val="0"/>
+                <w:color w:val="000000"/>
+                <w:sz w:val="18"/>
+              </w:rPr>
+              <w:t>100</w:t>
+            </w:r>
+          </w:p>
+        </w:tc>
+        <w:tc>
+          <w:tcPr>
+            <w:tcW w:type="dxa" w:w="1006"/>
+            <w:vAlign w:val="center"/>
+            <w:shd w:fill="DEEAF6"/>
+          </w:tcPr>
+          <w:p>
+            <w:pPr>
+              <w:spacing w:before="60" w:after="60"/>
+              <w:jc w:val="center"/>
+            </w:pPr>
+            <w:r>
+              <w:rPr>
+                <w:rFonts w:ascii="Times New Roman" w:hAnsi="Times New Roman"/>
+                <w:b w:val="0"/>
+                <w:color w:val="000000"/>
+                <w:sz w:val="18"/>
+              </w:rPr>
+              <w:t>50</w:t>
+            </w:r>
+          </w:p>
+        </w:tc>
+        <w:tc>
+          <w:tcPr>
+            <w:tcW w:type="dxa" w:w="1006"/>
+            <w:vAlign w:val="center"/>
+            <w:shd w:fill="DEEAF6"/>
+          </w:tcPr>
+          <w:p>
+            <w:pPr>
+              <w:spacing w:before="60" w:after="60"/>
+              <w:jc w:val="center"/>
+            </w:pPr>
+            <w:r>
+              <w:rPr>
+                <w:rFonts w:ascii="Times New Roman" w:hAnsi="Times New Roman"/>
+                <w:b w:val="0"/>
+                <w:color w:val="000000"/>
+                <w:sz w:val="18"/>
+              </w:rPr>
+              <w:t>50</w:t>
             </w:r>
           </w:p>
         </w:tc>

</xml_diff>